<commit_message>
Final adjustments and push, adding task 3
</commit_message>
<xml_diff>
--- a/Capstone Report/Capstone Task 2 Report.docx
+++ b/Capstone Report/Capstone Task 2 Report.docx
@@ -1017,7 +1017,7 @@
                 <w:noProof/>
                 <w:webHidden/>
               </w:rPr>
-              <w:t>9</w:t>
+              <w:t>8</w:t>
             </w:r>
             <w:r>
               <w:rPr>
@@ -1240,7 +1240,7 @@
                 <w:noProof/>
                 <w:webHidden/>
               </w:rPr>
-              <w:t>11</w:t>
+              <w:t>10</w:t>
             </w:r>
             <w:r>
               <w:rPr>
@@ -1314,7 +1314,7 @@
                 <w:noProof/>
                 <w:webHidden/>
               </w:rPr>
-              <w:t>11</w:t>
+              <w:t>10</w:t>
             </w:r>
             <w:r>
               <w:rPr>
@@ -1536,7 +1536,7 @@
                 <w:noProof/>
                 <w:webHidden/>
               </w:rPr>
-              <w:t>12</w:t>
+              <w:t>11</w:t>
             </w:r>
             <w:r>
               <w:rPr>
@@ -2648,7 +2648,7 @@
                 <w:noProof/>
                 <w:webHidden/>
               </w:rPr>
-              <w:t>21</w:t>
+              <w:t>20</w:t>
             </w:r>
             <w:r>
               <w:rPr>
@@ -2796,7 +2796,7 @@
                 <w:noProof/>
                 <w:webHidden/>
               </w:rPr>
-              <w:t>22</w:t>
+              <w:t>21</w:t>
             </w:r>
             <w:r>
               <w:rPr>
@@ -3366,12 +3366,6 @@
         <w:rPr>
           <w:rFonts w:ascii="Arial" w:hAnsi="Arial" w:cs="Arial"/>
         </w:rPr>
-        <w:tab/>
-      </w:r>
-      <w:r>
-        <w:rPr>
-          <w:rFonts w:ascii="Arial" w:hAnsi="Arial" w:cs="Arial"/>
-        </w:rPr>
         <w:t xml:space="preserve">Animal shelters </w:t>
       </w:r>
       <w:r>
@@ -3530,7 +3524,6 @@
         <w:rPr>
           <w:rFonts w:ascii="Arial" w:hAnsi="Arial" w:cs="Arial"/>
         </w:rPr>
-        <w:tab/>
         <w:t xml:space="preserve">The Austin Animal Center, in Austin, Texas, is one of the largest municipal no-kill shelters in the United States. Each year, the shelter intakes thousands of cats and dogs (and other animals), and </w:t>
       </w:r>
       <w:r>
@@ -3627,7 +3620,6 @@
     <w:p>
       <w:pPr>
         <w:spacing w:line="360" w:lineRule="auto"/>
-        <w:ind w:firstLine="720"/>
         <w:rPr>
           <w:rFonts w:ascii="Arial" w:hAnsi="Arial" w:cs="Arial"/>
         </w:rPr>
@@ -3672,19 +3664,25 @@
         <w:rPr>
           <w:rFonts w:ascii="Arial" w:hAnsi="Arial" w:cs="Arial"/>
         </w:rPr>
-        <w:t xml:space="preserve">behavioral support. The </w:t>
-      </w:r>
-      <w:r>
-        <w:rPr>
-          <w:rFonts w:ascii="Arial" w:hAnsi="Arial" w:cs="Arial"/>
-        </w:rPr>
-        <w:t xml:space="preserve">end </w:t>
-      </w:r>
-      <w:r>
-        <w:rPr>
-          <w:rFonts w:ascii="Arial" w:hAnsi="Arial" w:cs="Arial"/>
-        </w:rPr>
-        <w:t xml:space="preserve">result is that some animals </w:t>
+        <w:t xml:space="preserve">behavioral support. </w:t>
+      </w:r>
+      <w:r>
+        <w:rPr>
+          <w:rFonts w:ascii="Arial" w:hAnsi="Arial" w:cs="Arial"/>
+        </w:rPr>
+        <w:t xml:space="preserve">The </w:t>
+      </w:r>
+      <w:r>
+        <w:rPr>
+          <w:rFonts w:ascii="Arial" w:hAnsi="Arial" w:cs="Arial"/>
+        </w:rPr>
+        <w:t>result</w:t>
+      </w:r>
+      <w:r>
+        <w:rPr>
+          <w:rFonts w:ascii="Arial" w:hAnsi="Arial" w:cs="Arial"/>
+        </w:rPr>
+        <w:t xml:space="preserve"> is that some animals </w:t>
       </w:r>
       <w:r>
         <w:rPr>
@@ -3720,7 +3718,6 @@
     <w:p>
       <w:pPr>
         <w:spacing w:line="360" w:lineRule="auto"/>
-        <w:ind w:firstLine="720"/>
         <w:rPr>
           <w:rFonts w:ascii="Arial" w:hAnsi="Arial" w:cs="Arial"/>
         </w:rPr>
@@ -3833,20 +3830,19 @@
         <w:rPr>
           <w:rFonts w:ascii="Arial" w:hAnsi="Arial" w:cs="Arial"/>
         </w:rPr>
-        <w:t>experience and intuition rather than predictive analytics when allocating resources. A classification model trained on historical intake and outcome data offers a practical, evidence-</w:t>
+        <w:t xml:space="preserve">experience and intuition rather than predictive analytics when allocating resources. A classification model trained on historical intake and outcome data offers a practical, evidence-based approach to </w:t>
       </w:r>
       <w:r>
         <w:rPr>
           <w:rFonts w:ascii="Arial" w:hAnsi="Arial" w:cs="Arial"/>
         </w:rPr>
         <w:lastRenderedPageBreak/>
-        <w:t>based approach to identifying these at-risk animals earlier in their shelter stay. This data will help staff intervene proactively rather than reactively.</w:t>
+        <w:t>identifying these at-risk animals earlier in their shelter stay. This data will help staff intervene proactively rather than reactively.</w:t>
       </w:r>
     </w:p>
     <w:p>
       <w:pPr>
         <w:spacing w:line="360" w:lineRule="auto"/>
-        <w:ind w:firstLine="720"/>
         <w:rPr>
           <w:rFonts w:ascii="Arial" w:hAnsi="Arial" w:cs="Arial"/>
         </w:rPr>
@@ -4020,12 +4016,6 @@
           <w:rFonts w:ascii="Arial" w:hAnsi="Arial" w:cs="Arial"/>
         </w:rPr>
       </w:pPr>
-      <w:r>
-        <w:rPr>
-          <w:rFonts w:ascii="Arial" w:hAnsi="Arial" w:cs="Arial"/>
-        </w:rPr>
-        <w:tab/>
-      </w:r>
       <w:r>
         <w:rPr>
           <w:rFonts w:ascii="Arial" w:hAnsi="Arial" w:cs="Arial"/>
@@ -4334,7 +4324,6 @@
         <w:rPr>
           <w:rFonts w:ascii="Arial" w:hAnsi="Arial" w:cs="Arial"/>
         </w:rPr>
-        <w:tab/>
         <w:t>This study directly supports th</w:t>
       </w:r>
       <w:r>
@@ -4511,12 +4500,6 @@
       <w:r>
         <w:rPr>
           <w:rFonts w:ascii="Arial" w:hAnsi="Arial" w:cs="Arial"/>
-        </w:rPr>
-        <w:tab/>
-      </w:r>
-      <w:r>
-        <w:rPr>
-          <w:rFonts w:ascii="Arial" w:hAnsi="Arial" w:cs="Arial"/>
           <w:noProof/>
         </w:rPr>
         <w:t>Jardim et al. (2026) conducted</w:t>
@@ -4723,7 +4706,19 @@
         <w:rPr>
           <w:rFonts w:ascii="Arial" w:hAnsi="Arial" w:cs="Arial"/>
         </w:rPr>
-        <w:t xml:space="preserve"> the population balance of  75.6% indicated ongoing overcro</w:t>
+        <w:t xml:space="preserve"> the population balance </w:t>
+      </w:r>
+      <w:r>
+        <w:rPr>
+          <w:rFonts w:ascii="Arial" w:hAnsi="Arial" w:cs="Arial"/>
+        </w:rPr>
+        <w:t>of 75.6</w:t>
+      </w:r>
+      <w:r>
+        <w:rPr>
+          <w:rFonts w:ascii="Arial" w:hAnsi="Arial" w:cs="Arial"/>
+        </w:rPr>
+        <w:t>% indicated ongoing overcro</w:t>
       </w:r>
       <w:r>
         <w:rPr>
@@ -4805,12 +4800,6 @@
           <w:rFonts w:ascii="Arial" w:hAnsi="Arial" w:cs="Arial"/>
         </w:rPr>
         <w:lastRenderedPageBreak/>
-        <w:tab/>
-      </w:r>
-      <w:r>
-        <w:rPr>
-          <w:rFonts w:ascii="Arial" w:hAnsi="Arial" w:cs="Arial"/>
-        </w:rPr>
         <w:t>This study supports the project</w:t>
       </w:r>
       <w:r>
@@ -4970,14 +4959,6 @@
           <w:rFonts w:ascii="Arial" w:hAnsi="Arial" w:cs="Arial"/>
         </w:rPr>
       </w:pPr>
-      <w:r>
-        <w:rPr>
-          <w:rFonts w:ascii="Arial" w:hAnsi="Arial" w:cs="Arial"/>
-          <w:i/>
-          <w:iCs/>
-        </w:rPr>
-        <w:tab/>
-      </w:r>
       <w:r>
         <w:rPr>
           <w:rFonts w:ascii="Arial" w:hAnsi="Arial" w:cs="Arial"/>
@@ -5226,12 +5207,6 @@
         <w:rPr>
           <w:rFonts w:ascii="Arial" w:hAnsi="Arial" w:cs="Arial"/>
         </w:rPr>
-        <w:tab/>
-      </w:r>
-      <w:r>
-        <w:rPr>
-          <w:rFonts w:ascii="Arial" w:hAnsi="Arial" w:cs="Arial"/>
-        </w:rPr>
         <w:t xml:space="preserve">This study </w:t>
       </w:r>
       <w:r>
@@ -5477,7 +5452,6 @@
     <w:p>
       <w:pPr>
         <w:spacing w:line="360" w:lineRule="auto"/>
-        <w:ind w:firstLine="720"/>
         <w:rPr>
           <w:rFonts w:ascii="Arial" w:hAnsi="Arial" w:cs="Arial"/>
         </w:rPr>
@@ -5615,12 +5589,14 @@
         </w:rPr>
         <w:t xml:space="preserve">articipants rated the </w:t>
       </w:r>
+      <w:proofErr w:type="gramStart"/>
       <w:r>
         <w:rPr>
           <w:rFonts w:ascii="Arial" w:hAnsi="Arial" w:cs="Arial"/>
         </w:rPr>
         <w:t>cats'</w:t>
       </w:r>
+      <w:proofErr w:type="gramEnd"/>
       <w:r>
         <w:rPr>
           <w:rFonts w:ascii="Arial" w:hAnsi="Arial" w:cs="Arial"/>
@@ -5697,14 +5673,14 @@
         <w:rPr>
           <w:rFonts w:ascii="Arial" w:hAnsi="Arial" w:cs="Arial"/>
         </w:rPr>
-        <w:t xml:space="preserve">s significantly less </w:t>
+        <w:t xml:space="preserve">s significantly less adoptable than cats </w:t>
       </w:r>
       <w:r>
         <w:rPr>
           <w:rFonts w:ascii="Arial" w:hAnsi="Arial" w:cs="Arial"/>
         </w:rPr>
         <w:lastRenderedPageBreak/>
-        <w:t xml:space="preserve">adoptable than cats of </w:t>
+        <w:t xml:space="preserve">of </w:t>
       </w:r>
       <w:r>
         <w:rPr>
@@ -5772,7 +5748,6 @@
         <w:rPr>
           <w:rFonts w:ascii="Arial" w:hAnsi="Arial" w:cs="Arial"/>
         </w:rPr>
-        <w:tab/>
         <w:t>This study supports th</w:t>
       </w:r>
       <w:r>
@@ -5950,12 +5925,6 @@
           <w:rFonts w:ascii="Arial" w:hAnsi="Arial" w:cs="Arial"/>
         </w:rPr>
       </w:pPr>
-      <w:r>
-        <w:rPr>
-          <w:rFonts w:ascii="Arial" w:hAnsi="Arial" w:cs="Arial"/>
-        </w:rPr>
-        <w:tab/>
-      </w:r>
       <w:r>
         <w:rPr>
           <w:rFonts w:ascii="Arial" w:hAnsi="Arial" w:cs="Arial"/>
@@ -6204,7 +6173,6 @@
         <w:rPr>
           <w:rFonts w:ascii="Arial" w:hAnsi="Arial" w:cs="Arial"/>
         </w:rPr>
-        <w:tab/>
         <w:t xml:space="preserve">This study supports the organizational need described in this project by demonstrating that data-driven, targeted </w:t>
       </w:r>
       <w:r>
@@ -6318,60 +6286,60 @@
         <w:rPr>
           <w:rFonts w:ascii="Arial" w:hAnsi="Arial" w:cs="Arial"/>
         </w:rPr>
+        <w:t>Review of Work 6</w:t>
+      </w:r>
+      <w:bookmarkEnd w:id="11"/>
+    </w:p>
+    <w:p>
+      <w:pPr>
+        <w:spacing w:line="360" w:lineRule="auto"/>
+        <w:rPr>
+          <w:rFonts w:ascii="Arial" w:hAnsi="Arial" w:cs="Arial"/>
+        </w:rPr>
+      </w:pPr>
+      <w:r>
+        <w:rPr>
+          <w:rFonts w:ascii="Arial" w:hAnsi="Arial" w:cs="Arial"/>
+          <w:noProof/>
+        </w:rPr>
+        <w:t>Parte (2019)</w:t>
+      </w:r>
+      <w:r>
+        <w:rPr>
+          <w:rFonts w:ascii="Arial" w:hAnsi="Arial" w:cs="Arial"/>
+        </w:rPr>
+        <w:t xml:space="preserve"> conducted a machine learning study using </w:t>
+      </w:r>
+      <w:r>
+        <w:rPr>
+          <w:rFonts w:ascii="Arial" w:hAnsi="Arial" w:cs="Arial"/>
+        </w:rPr>
+        <w:t xml:space="preserve">the </w:t>
+      </w:r>
+      <w:r>
+        <w:rPr>
+          <w:rFonts w:ascii="Arial" w:hAnsi="Arial" w:cs="Arial"/>
+        </w:rPr>
+        <w:t xml:space="preserve">Austin Animal Center </w:t>
+      </w:r>
+      <w:r>
+        <w:rPr>
+          <w:rFonts w:ascii="Arial" w:hAnsi="Arial" w:cs="Arial"/>
+        </w:rPr>
+        <w:t>O</w:t>
+      </w:r>
+      <w:r>
+        <w:rPr>
+          <w:rFonts w:ascii="Arial" w:hAnsi="Arial" w:cs="Arial"/>
+        </w:rPr>
+        <w:t xml:space="preserve">utcome data to classify and predict animal outcomes using 4 supervised learning models: logistic regression, </w:t>
+      </w:r>
+      <w:r>
+        <w:rPr>
+          <w:rFonts w:ascii="Arial" w:hAnsi="Arial" w:cs="Arial"/>
+        </w:rPr>
         <w:lastRenderedPageBreak/>
-        <w:t>Review of Work 6</w:t>
-      </w:r>
-      <w:bookmarkEnd w:id="11"/>
-    </w:p>
-    <w:p>
-      <w:pPr>
-        <w:spacing w:line="360" w:lineRule="auto"/>
-        <w:rPr>
-          <w:rFonts w:ascii="Arial" w:hAnsi="Arial" w:cs="Arial"/>
-        </w:rPr>
-      </w:pPr>
-      <w:r>
-        <w:rPr>
-          <w:rFonts w:ascii="Arial" w:hAnsi="Arial" w:cs="Arial"/>
-        </w:rPr>
-        <w:tab/>
-      </w:r>
-      <w:r>
-        <w:rPr>
-          <w:rFonts w:ascii="Arial" w:hAnsi="Arial" w:cs="Arial"/>
-          <w:noProof/>
-        </w:rPr>
-        <w:t>Parte (2019)</w:t>
-      </w:r>
-      <w:r>
-        <w:rPr>
-          <w:rFonts w:ascii="Arial" w:hAnsi="Arial" w:cs="Arial"/>
-        </w:rPr>
-        <w:t xml:space="preserve"> conducted a machine learning study using </w:t>
-      </w:r>
-      <w:r>
-        <w:rPr>
-          <w:rFonts w:ascii="Arial" w:hAnsi="Arial" w:cs="Arial"/>
-        </w:rPr>
-        <w:t xml:space="preserve">the </w:t>
-      </w:r>
-      <w:r>
-        <w:rPr>
-          <w:rFonts w:ascii="Arial" w:hAnsi="Arial" w:cs="Arial"/>
-        </w:rPr>
-        <w:t xml:space="preserve">Austin Animal Center </w:t>
-      </w:r>
-      <w:r>
-        <w:rPr>
-          <w:rFonts w:ascii="Arial" w:hAnsi="Arial" w:cs="Arial"/>
-        </w:rPr>
-        <w:t>O</w:t>
-      </w:r>
-      <w:r>
-        <w:rPr>
-          <w:rFonts w:ascii="Arial" w:hAnsi="Arial" w:cs="Arial"/>
-        </w:rPr>
-        <w:t>utcome data to classify and predict animal outcomes using 4 supervised learning models: logistic regression, neural</w:t>
+        <w:t>neural</w:t>
       </w:r>
       <w:r>
         <w:rPr>
@@ -6566,7 +6534,6 @@
         <w:rPr>
           <w:rFonts w:ascii="Arial" w:hAnsi="Arial" w:cs="Arial"/>
         </w:rPr>
-        <w:tab/>
         <w:t xml:space="preserve">This study directly supports </w:t>
       </w:r>
       <w:r>
@@ -6663,7 +6630,19 @@
         <w:rPr>
           <w:rFonts w:ascii="Arial" w:hAnsi="Arial" w:cs="Arial"/>
         </w:rPr>
-        <w:t>2013-2025</w:t>
+        <w:t>2013</w:t>
+      </w:r>
+      <w:r>
+        <w:rPr>
+          <w:rFonts w:ascii="Arial" w:hAnsi="Arial" w:cs="Arial"/>
+        </w:rPr>
+        <w:t xml:space="preserve"> to </w:t>
+      </w:r>
+      <w:r>
+        <w:rPr>
+          <w:rFonts w:ascii="Arial" w:hAnsi="Arial" w:cs="Arial"/>
+        </w:rPr>
+        <w:t>2025</w:t>
       </w:r>
       <w:r>
         <w:rPr>
@@ -6789,7 +6768,6 @@
         <w:rPr>
           <w:rFonts w:ascii="Arial" w:hAnsi="Arial" w:cs="Arial"/>
         </w:rPr>
-        <w:tab/>
         <w:t xml:space="preserve">This project </w:t>
       </w:r>
       <w:r>
@@ -6919,7 +6897,6 @@
         <w:rPr>
           <w:rFonts w:ascii="Arial" w:hAnsi="Arial" w:cs="Arial"/>
         </w:rPr>
-        <w:tab/>
         <w:t>The Austin Animal Center</w:t>
       </w:r>
       <w:r>
@@ -7102,68 +7079,68 @@
         <w:rPr>
           <w:rFonts w:ascii="Arial" w:hAnsi="Arial" w:cs="Arial"/>
         </w:rPr>
+        <w:t>The</w:t>
+      </w:r>
+      <w:r>
+        <w:rPr>
+          <w:rFonts w:ascii="Arial" w:hAnsi="Arial" w:cs="Arial"/>
+        </w:rPr>
+        <w:t xml:space="preserve"> random forest classifier was trained on 80%</w:t>
+      </w:r>
+      <w:r>
+        <w:rPr>
+          <w:rFonts w:ascii="Arial" w:hAnsi="Arial" w:cs="Arial"/>
+        </w:rPr>
+        <w:t xml:space="preserve"> of the data and </w:t>
+      </w:r>
+      <w:r>
+        <w:rPr>
+          <w:rFonts w:ascii="Arial" w:hAnsi="Arial" w:cs="Arial"/>
+        </w:rPr>
+        <w:t xml:space="preserve">was </w:t>
+      </w:r>
+      <w:r>
+        <w:rPr>
+          <w:rFonts w:ascii="Arial" w:hAnsi="Arial" w:cs="Arial"/>
+        </w:rPr>
+        <w:t>evaluated on the remaining 20% using precision, recall, F1-score</w:t>
+      </w:r>
+      <w:r>
+        <w:rPr>
+          <w:rFonts w:ascii="Arial" w:hAnsi="Arial" w:cs="Arial"/>
+        </w:rPr>
+        <w:t>, and a confusion matrix. Th</w:t>
+      </w:r>
+      <w:r>
+        <w:rPr>
+          <w:rFonts w:ascii="Arial" w:hAnsi="Arial" w:cs="Arial"/>
+        </w:rPr>
+        <w:t>is</w:t>
+      </w:r>
+      <w:r>
+        <w:rPr>
+          <w:rFonts w:ascii="Arial" w:hAnsi="Arial" w:cs="Arial"/>
+        </w:rPr>
+        <w:t xml:space="preserve"> model achieved an overall </w:t>
+      </w:r>
+      <w:r>
+        <w:rPr>
+          <w:rFonts w:ascii="Arial" w:hAnsi="Arial" w:cs="Arial"/>
+        </w:rPr>
+        <w:t>accuracy of 76%, correctly predicting adoption outcomes for appro</w:t>
+      </w:r>
+      <w:r>
+        <w:rPr>
+          <w:rFonts w:ascii="Arial" w:hAnsi="Arial" w:cs="Arial"/>
+        </w:rPr>
+        <w:t xml:space="preserve">ximately three out </w:t>
+      </w:r>
+      <w:r>
+        <w:rPr>
+          <w:rFonts w:ascii="Arial" w:hAnsi="Arial" w:cs="Arial"/>
+        </w:rPr>
         <w:lastRenderedPageBreak/>
-        <w:tab/>
-      </w:r>
-      <w:r>
-        <w:rPr>
-          <w:rFonts w:ascii="Arial" w:hAnsi="Arial" w:cs="Arial"/>
-        </w:rPr>
-        <w:t>The</w:t>
-      </w:r>
-      <w:r>
-        <w:rPr>
-          <w:rFonts w:ascii="Arial" w:hAnsi="Arial" w:cs="Arial"/>
-        </w:rPr>
-        <w:t xml:space="preserve"> random forest classifier was trained on 80%</w:t>
-      </w:r>
-      <w:r>
-        <w:rPr>
-          <w:rFonts w:ascii="Arial" w:hAnsi="Arial" w:cs="Arial"/>
-        </w:rPr>
-        <w:t xml:space="preserve"> of the data and </w:t>
-      </w:r>
-      <w:r>
-        <w:rPr>
-          <w:rFonts w:ascii="Arial" w:hAnsi="Arial" w:cs="Arial"/>
-        </w:rPr>
-        <w:t xml:space="preserve">was </w:t>
-      </w:r>
-      <w:r>
-        <w:rPr>
-          <w:rFonts w:ascii="Arial" w:hAnsi="Arial" w:cs="Arial"/>
-        </w:rPr>
-        <w:t>evaluated on the remaining 20% using precision, recall, F1-score</w:t>
-      </w:r>
-      <w:r>
-        <w:rPr>
-          <w:rFonts w:ascii="Arial" w:hAnsi="Arial" w:cs="Arial"/>
-        </w:rPr>
-        <w:t>, and a confusion matrix. Th</w:t>
-      </w:r>
-      <w:r>
-        <w:rPr>
-          <w:rFonts w:ascii="Arial" w:hAnsi="Arial" w:cs="Arial"/>
-        </w:rPr>
-        <w:t>is</w:t>
-      </w:r>
-      <w:r>
-        <w:rPr>
-          <w:rFonts w:ascii="Arial" w:hAnsi="Arial" w:cs="Arial"/>
-        </w:rPr>
-        <w:t xml:space="preserve"> model achieved an overall </w:t>
-      </w:r>
-      <w:r>
-        <w:rPr>
-          <w:rFonts w:ascii="Arial" w:hAnsi="Arial" w:cs="Arial"/>
-        </w:rPr>
-        <w:t>accuracy of 76%, correctly predicting adoption outcomes for appro</w:t>
-      </w:r>
-      <w:r>
-        <w:rPr>
-          <w:rFonts w:ascii="Arial" w:hAnsi="Arial" w:cs="Arial"/>
-        </w:rPr>
-        <w:t>ximately three out of four animals. Length of stay emerged as the strongest</w:t>
+        <w:t>of four animals. Length of stay emerged as the strongest</w:t>
       </w:r>
       <w:r>
         <w:rPr>
@@ -7239,7 +7216,6 @@
     <w:p>
       <w:pPr>
         <w:spacing w:line="360" w:lineRule="auto"/>
-        <w:ind w:firstLine="720"/>
         <w:rPr>
           <w:rFonts w:ascii="Arial" w:hAnsi="Arial" w:cs="Arial"/>
           <w:color w:val="000000" w:themeColor="text1"/>
@@ -7354,7 +7330,6 @@
     <w:p>
       <w:pPr>
         <w:spacing w:line="360" w:lineRule="auto"/>
-        <w:ind w:firstLine="720"/>
         <w:rPr>
           <w:rFonts w:ascii="Arial" w:hAnsi="Arial" w:cs="Arial"/>
           <w:color w:val="000000" w:themeColor="text1"/>
@@ -7483,7 +7458,6 @@
     <w:p>
       <w:pPr>
         <w:spacing w:line="360" w:lineRule="auto"/>
-        <w:ind w:firstLine="720"/>
         <w:rPr>
           <w:rFonts w:ascii="Arial" w:hAnsi="Arial" w:cs="Arial"/>
           <w:color w:val="000000" w:themeColor="text1"/>
@@ -7857,7 +7831,6 @@
           <w:b/>
           <w:bCs/>
         </w:rPr>
-        <w:lastRenderedPageBreak/>
         <w:t>Objective 1</w:t>
       </w:r>
       <w:r>
@@ -7949,6 +7922,7 @@
           <w:b/>
           <w:bCs/>
         </w:rPr>
+        <w:lastRenderedPageBreak/>
         <w:t>Deliverable</w:t>
       </w:r>
       <w:r>
@@ -8308,6 +8282,16 @@
     </w:p>
     <w:p>
       <w:pPr>
+        <w:pStyle w:val="ListParagraph"/>
+        <w:spacing w:line="360" w:lineRule="auto"/>
+        <w:ind w:left="2652"/>
+        <w:rPr>
+          <w:rFonts w:ascii="Arial" w:hAnsi="Arial" w:cs="Arial"/>
+        </w:rPr>
+      </w:pPr>
+    </w:p>
+    <w:p>
+      <w:pPr>
         <w:pStyle w:val="Heading2"/>
         <w:spacing w:before="0" w:line="360" w:lineRule="auto"/>
         <w:rPr>
@@ -8386,7 +8370,6 @@
     <w:p>
       <w:pPr>
         <w:spacing w:line="360" w:lineRule="auto"/>
-        <w:ind w:firstLine="720"/>
         <w:rPr>
           <w:rFonts w:ascii="Arial" w:hAnsi="Arial" w:cs="Arial"/>
         </w:rPr>
@@ -8573,22 +8556,156 @@
         <w:rPr>
           <w:rFonts w:ascii="Arial" w:hAnsi="Arial" w:cs="Arial"/>
         </w:rPr>
+        <w:t>B.2.</w:t>
+      </w:r>
+      <w:r>
+        <w:rPr>
+          <w:rFonts w:ascii="Arial" w:hAnsi="Arial" w:cs="Arial"/>
+        </w:rPr>
+        <w:t>B</w:t>
+      </w:r>
+      <w:r>
+        <w:rPr>
+          <w:rFonts w:ascii="Arial" w:hAnsi="Arial" w:cs="Arial"/>
+        </w:rPr>
+        <w:t xml:space="preserve"> Not included in Project Scope</w:t>
+      </w:r>
+      <w:bookmarkEnd w:id="18"/>
+    </w:p>
+    <w:p>
+      <w:pPr>
+        <w:spacing w:line="360" w:lineRule="auto"/>
+        <w:rPr>
+          <w:rFonts w:ascii="Arial" w:hAnsi="Arial" w:cs="Arial"/>
+        </w:rPr>
+      </w:pPr>
+      <w:r>
+        <w:rPr>
+          <w:rFonts w:ascii="Arial" w:hAnsi="Arial" w:cs="Arial"/>
+        </w:rPr>
+        <w:t>This project does not include animals other than dogs and cats</w:t>
+      </w:r>
+      <w:r>
+        <w:rPr>
+          <w:rFonts w:ascii="Arial" w:hAnsi="Arial" w:cs="Arial"/>
+        </w:rPr>
+        <w:t xml:space="preserve">. It does not include data </w:t>
+      </w:r>
+      <w:r>
+        <w:rPr>
+          <w:rFonts w:ascii="Arial" w:hAnsi="Arial" w:cs="Arial"/>
+        </w:rPr>
+        <w:t>from any other shelter</w:t>
+      </w:r>
+      <w:r>
+        <w:rPr>
+          <w:rFonts w:ascii="Arial" w:hAnsi="Arial" w:cs="Arial"/>
+        </w:rPr>
+        <w:t xml:space="preserve"> other</w:t>
+      </w:r>
+      <w:r>
+        <w:rPr>
+          <w:rFonts w:ascii="Arial" w:hAnsi="Arial" w:cs="Arial"/>
+        </w:rPr>
+        <w:t xml:space="preserve"> </w:t>
+      </w:r>
+      <w:r>
+        <w:rPr>
+          <w:rFonts w:ascii="Arial" w:hAnsi="Arial" w:cs="Arial"/>
+        </w:rPr>
+        <w:t xml:space="preserve">than the Austin Animal Center, and it does not incorporate the newer </w:t>
+      </w:r>
+      <w:r>
+        <w:rPr>
+          <w:rFonts w:ascii="Arial" w:hAnsi="Arial" w:cs="Arial"/>
+        </w:rPr>
         <w:lastRenderedPageBreak/>
-        <w:t>B.2.</w:t>
-      </w:r>
-      <w:r>
-        <w:rPr>
-          <w:rFonts w:ascii="Arial" w:hAnsi="Arial" w:cs="Arial"/>
-        </w:rPr>
-        <w:t>B</w:t>
-      </w:r>
-      <w:r>
-        <w:rPr>
-          <w:rFonts w:ascii="Arial" w:hAnsi="Arial" w:cs="Arial"/>
-        </w:rPr>
-        <w:t xml:space="preserve"> Not included in Project Scope</w:t>
-      </w:r>
-      <w:bookmarkEnd w:id="18"/>
+        <w:t>2025 datasets on the City of Austin's sit</w:t>
+      </w:r>
+      <w:r>
+        <w:rPr>
+          <w:rFonts w:ascii="Arial" w:hAnsi="Arial" w:cs="Arial"/>
+        </w:rPr>
+        <w:t>e because of</w:t>
+      </w:r>
+      <w:r>
+        <w:rPr>
+          <w:rFonts w:ascii="Arial" w:hAnsi="Arial" w:cs="Arial"/>
+        </w:rPr>
+        <w:t xml:space="preserve"> </w:t>
+      </w:r>
+      <w:r>
+        <w:rPr>
+          <w:rFonts w:ascii="Arial" w:hAnsi="Arial" w:cs="Arial"/>
+        </w:rPr>
+        <w:t>incompatible</w:t>
+      </w:r>
+      <w:r>
+        <w:rPr>
+          <w:rFonts w:ascii="Arial" w:hAnsi="Arial" w:cs="Arial"/>
+        </w:rPr>
+        <w:t xml:space="preserve"> </w:t>
+      </w:r>
+      <w:r>
+        <w:rPr>
+          <w:rFonts w:ascii="Arial" w:hAnsi="Arial" w:cs="Arial"/>
+        </w:rPr>
+        <w:t>column structures</w:t>
+      </w:r>
+      <w:r>
+        <w:rPr>
+          <w:rFonts w:ascii="Arial" w:hAnsi="Arial" w:cs="Arial"/>
+        </w:rPr>
+        <w:t xml:space="preserve"> from a new system</w:t>
+      </w:r>
+      <w:r>
+        <w:rPr>
+          <w:rFonts w:ascii="Arial" w:hAnsi="Arial" w:cs="Arial"/>
+        </w:rPr>
+        <w:t xml:space="preserve">. </w:t>
+      </w:r>
+      <w:r>
+        <w:rPr>
+          <w:rFonts w:ascii="Arial" w:hAnsi="Arial" w:cs="Arial"/>
+        </w:rPr>
+        <w:t>This project does not include real-time predictions or deploy</w:t>
+      </w:r>
+      <w:r>
+        <w:rPr>
+          <w:rFonts w:ascii="Arial" w:hAnsi="Arial" w:cs="Arial"/>
+        </w:rPr>
+        <w:t xml:space="preserve">ment of the model as a live operational tool within the shelter system. It also does not include </w:t>
+      </w:r>
+      <w:r>
+        <w:rPr>
+          <w:rFonts w:ascii="Arial" w:hAnsi="Arial" w:cs="Arial"/>
+        </w:rPr>
+        <w:t xml:space="preserve">a cost-benefit analysis of shelter interventions or an assessment of staff behavior and decision-making practices. Recommendations </w:t>
+      </w:r>
+      <w:r>
+        <w:rPr>
+          <w:rFonts w:ascii="Arial" w:hAnsi="Arial" w:cs="Arial"/>
+        </w:rPr>
+        <w:t>provided</w:t>
+      </w:r>
+      <w:r>
+        <w:rPr>
+          <w:rFonts w:ascii="Arial" w:hAnsi="Arial" w:cs="Arial"/>
+        </w:rPr>
+        <w:t xml:space="preserve"> in the final report are based solely on historical data patterns and are not inte</w:t>
+      </w:r>
+      <w:r>
+        <w:rPr>
+          <w:rFonts w:ascii="Arial" w:hAnsi="Arial" w:cs="Arial"/>
+        </w:rPr>
+        <w:t>nded to inform rather than replace professional judgment.</w:t>
+      </w:r>
+      <w:r>
+        <w:rPr>
+          <w:rFonts w:ascii="Arial" w:hAnsi="Arial" w:cs="Arial"/>
+        </w:rPr>
+        <w:t xml:space="preserve"> </w:t>
+      </w:r>
     </w:p>
     <w:p>
       <w:pPr>
@@ -8598,135 +8715,6 @@
           <w:rFonts w:ascii="Arial" w:hAnsi="Arial" w:cs="Arial"/>
         </w:rPr>
       </w:pPr>
-      <w:r>
-        <w:rPr>
-          <w:rFonts w:ascii="Arial" w:hAnsi="Arial" w:cs="Arial"/>
-        </w:rPr>
-        <w:t>This project does not include animals other than dogs and cats</w:t>
-      </w:r>
-      <w:r>
-        <w:rPr>
-          <w:rFonts w:ascii="Arial" w:hAnsi="Arial" w:cs="Arial"/>
-        </w:rPr>
-        <w:t xml:space="preserve">. It does not include data </w:t>
-      </w:r>
-      <w:r>
-        <w:rPr>
-          <w:rFonts w:ascii="Arial" w:hAnsi="Arial" w:cs="Arial"/>
-        </w:rPr>
-        <w:t>from any other shelter</w:t>
-      </w:r>
-      <w:r>
-        <w:rPr>
-          <w:rFonts w:ascii="Arial" w:hAnsi="Arial" w:cs="Arial"/>
-        </w:rPr>
-        <w:t xml:space="preserve"> other</w:t>
-      </w:r>
-      <w:r>
-        <w:rPr>
-          <w:rFonts w:ascii="Arial" w:hAnsi="Arial" w:cs="Arial"/>
-        </w:rPr>
-        <w:t xml:space="preserve"> </w:t>
-      </w:r>
-      <w:r>
-        <w:rPr>
-          <w:rFonts w:ascii="Arial" w:hAnsi="Arial" w:cs="Arial"/>
-        </w:rPr>
-        <w:t>than the Austin Animal Center, and it does not incorporate the newer 2025 datasets on the City of Austin's sit</w:t>
-      </w:r>
-      <w:r>
-        <w:rPr>
-          <w:rFonts w:ascii="Arial" w:hAnsi="Arial" w:cs="Arial"/>
-        </w:rPr>
-        <w:t>e because of</w:t>
-      </w:r>
-      <w:r>
-        <w:rPr>
-          <w:rFonts w:ascii="Arial" w:hAnsi="Arial" w:cs="Arial"/>
-        </w:rPr>
-        <w:t xml:space="preserve"> </w:t>
-      </w:r>
-      <w:r>
-        <w:rPr>
-          <w:rFonts w:ascii="Arial" w:hAnsi="Arial" w:cs="Arial"/>
-        </w:rPr>
-        <w:t>incompatible</w:t>
-      </w:r>
-      <w:r>
-        <w:rPr>
-          <w:rFonts w:ascii="Arial" w:hAnsi="Arial" w:cs="Arial"/>
-        </w:rPr>
-        <w:t xml:space="preserve"> </w:t>
-      </w:r>
-      <w:r>
-        <w:rPr>
-          <w:rFonts w:ascii="Arial" w:hAnsi="Arial" w:cs="Arial"/>
-        </w:rPr>
-        <w:t>column structures</w:t>
-      </w:r>
-      <w:r>
-        <w:rPr>
-          <w:rFonts w:ascii="Arial" w:hAnsi="Arial" w:cs="Arial"/>
-        </w:rPr>
-        <w:t xml:space="preserve"> from a new system</w:t>
-      </w:r>
-      <w:r>
-        <w:rPr>
-          <w:rFonts w:ascii="Arial" w:hAnsi="Arial" w:cs="Arial"/>
-        </w:rPr>
-        <w:t xml:space="preserve">. </w:t>
-      </w:r>
-      <w:r>
-        <w:rPr>
-          <w:rFonts w:ascii="Arial" w:hAnsi="Arial" w:cs="Arial"/>
-        </w:rPr>
-        <w:t>This project does not include real-time predictions or deploy</w:t>
-      </w:r>
-      <w:r>
-        <w:rPr>
-          <w:rFonts w:ascii="Arial" w:hAnsi="Arial" w:cs="Arial"/>
-        </w:rPr>
-        <w:t xml:space="preserve">ment of the model as a live operational tool within the shelter system. It also does not include </w:t>
-      </w:r>
-      <w:r>
-        <w:rPr>
-          <w:rFonts w:ascii="Arial" w:hAnsi="Arial" w:cs="Arial"/>
-        </w:rPr>
-        <w:t xml:space="preserve">a cost-benefit analysis of shelter interventions or an assessment of staff behavior and decision-making practices. Recommendations </w:t>
-      </w:r>
-      <w:r>
-        <w:rPr>
-          <w:rFonts w:ascii="Arial" w:hAnsi="Arial" w:cs="Arial"/>
-        </w:rPr>
-        <w:t>provided</w:t>
-      </w:r>
-      <w:r>
-        <w:rPr>
-          <w:rFonts w:ascii="Arial" w:hAnsi="Arial" w:cs="Arial"/>
-        </w:rPr>
-        <w:t xml:space="preserve"> in the final report are based solely on historical data patterns and are not inte</w:t>
-      </w:r>
-      <w:r>
-        <w:rPr>
-          <w:rFonts w:ascii="Arial" w:hAnsi="Arial" w:cs="Arial"/>
-        </w:rPr>
-        <w:t>nded to inform rather than replace professional judgment.</w:t>
-      </w:r>
-      <w:r>
-        <w:rPr>
-          <w:rFonts w:ascii="Arial" w:hAnsi="Arial" w:cs="Arial"/>
-        </w:rPr>
-        <w:t xml:space="preserve"> </w:t>
-      </w:r>
-    </w:p>
-    <w:p>
-      <w:pPr>
-        <w:spacing w:line="360" w:lineRule="auto"/>
-        <w:ind w:firstLine="720"/>
-        <w:rPr>
-          <w:rFonts w:ascii="Arial" w:hAnsi="Arial" w:cs="Arial"/>
-        </w:rPr>
-      </w:pPr>
     </w:p>
     <w:p>
       <w:pPr>
@@ -8768,13 +8756,6 @@
           <w:color w:val="000000" w:themeColor="text1"/>
         </w:rPr>
       </w:pPr>
-      <w:r>
-        <w:rPr>
-          <w:rFonts w:ascii="Arial" w:hAnsi="Arial" w:cs="Arial"/>
-          <w:color w:val="00B050"/>
-        </w:rPr>
-        <w:tab/>
-      </w:r>
       <w:r>
         <w:rPr>
           <w:rFonts w:ascii="Arial" w:hAnsi="Arial" w:cs="Arial"/>
@@ -8931,13 +8912,15 @@
           <w:color w:val="000000" w:themeColor="text1"/>
         </w:rPr>
       </w:pPr>
-      <w:r>
-        <w:rPr>
-          <w:rFonts w:ascii="Arial" w:hAnsi="Arial" w:cs="Arial"/>
-          <w:color w:val="000000" w:themeColor="text1"/>
-        </w:rPr>
-        <w:tab/>
-      </w:r>
+    </w:p>
+    <w:p>
+      <w:pPr>
+        <w:spacing w:line="360" w:lineRule="auto"/>
+        <w:rPr>
+          <w:rFonts w:ascii="Arial" w:hAnsi="Arial" w:cs="Arial"/>
+          <w:color w:val="000000" w:themeColor="text1"/>
+        </w:rPr>
+      </w:pPr>
       <w:r>
         <w:rPr>
           <w:rFonts w:ascii="Arial" w:hAnsi="Arial" w:cs="Arial"/>
@@ -9029,7 +9012,21 @@
           <w:rFonts w:ascii="Arial" w:hAnsi="Arial" w:cs="Arial"/>
           <w:color w:val="000000" w:themeColor="text1"/>
         </w:rPr>
-        <w:t xml:space="preserve"> earlier in order to improve live release rates, establishes the foundation for the remaining phases.</w:t>
+        <w:t xml:space="preserve"> earlier </w:t>
+      </w:r>
+      <w:r>
+        <w:rPr>
+          <w:rFonts w:ascii="Arial" w:hAnsi="Arial" w:cs="Arial"/>
+          <w:color w:val="000000" w:themeColor="text1"/>
+        </w:rPr>
+        <w:t>to</w:t>
+      </w:r>
+      <w:r>
+        <w:rPr>
+          <w:rFonts w:ascii="Arial" w:hAnsi="Arial" w:cs="Arial"/>
+          <w:color w:val="000000" w:themeColor="text1"/>
+        </w:rPr>
+        <w:t xml:space="preserve"> improve live release rates, establishes the foundation for the remaining phases.</w:t>
       </w:r>
     </w:p>
     <w:p>
@@ -9040,13 +9037,15 @@
           <w:color w:val="000000" w:themeColor="text1"/>
         </w:rPr>
       </w:pPr>
-      <w:r>
-        <w:rPr>
-          <w:rFonts w:ascii="Arial" w:hAnsi="Arial" w:cs="Arial"/>
-          <w:color w:val="000000" w:themeColor="text1"/>
-        </w:rPr>
-        <w:tab/>
-      </w:r>
+    </w:p>
+    <w:p>
+      <w:pPr>
+        <w:spacing w:line="360" w:lineRule="auto"/>
+        <w:rPr>
+          <w:rFonts w:ascii="Arial" w:hAnsi="Arial" w:cs="Arial"/>
+          <w:color w:val="000000" w:themeColor="text1"/>
+        </w:rPr>
+      </w:pPr>
       <w:r>
         <w:rPr>
           <w:rFonts w:ascii="Arial" w:hAnsi="Arial" w:cs="Arial"/>
@@ -9158,7 +9157,15 @@
     <w:p>
       <w:pPr>
         <w:spacing w:line="360" w:lineRule="auto"/>
-        <w:ind w:firstLine="720"/>
+        <w:rPr>
+          <w:rFonts w:ascii="Arial" w:hAnsi="Arial" w:cs="Arial"/>
+          <w:color w:val="000000" w:themeColor="text1"/>
+        </w:rPr>
+      </w:pPr>
+    </w:p>
+    <w:p>
+      <w:pPr>
+        <w:spacing w:line="360" w:lineRule="auto"/>
         <w:rPr>
           <w:rFonts w:ascii="Arial" w:hAnsi="Arial" w:cs="Arial"/>
           <w:color w:val="000000" w:themeColor="text1"/>
@@ -9262,6 +9269,15 @@
           <w:color w:val="000000" w:themeColor="text1"/>
         </w:rPr>
       </w:pPr>
+    </w:p>
+    <w:p>
+      <w:pPr>
+        <w:spacing w:line="360" w:lineRule="auto"/>
+        <w:rPr>
+          <w:rFonts w:ascii="Arial" w:hAnsi="Arial" w:cs="Arial"/>
+          <w:color w:val="000000" w:themeColor="text1"/>
+        </w:rPr>
+      </w:pPr>
       <w:r>
         <w:rPr>
           <w:rFonts w:ascii="Arial" w:hAnsi="Arial" w:cs="Arial"/>
@@ -9360,7 +9376,15 @@
     <w:p>
       <w:pPr>
         <w:spacing w:line="360" w:lineRule="auto"/>
-        <w:ind w:firstLine="720"/>
+        <w:rPr>
+          <w:rFonts w:ascii="Arial" w:hAnsi="Arial" w:cs="Arial"/>
+          <w:color w:val="000000" w:themeColor="text1"/>
+        </w:rPr>
+      </w:pPr>
+    </w:p>
+    <w:p>
+      <w:pPr>
+        <w:spacing w:line="360" w:lineRule="auto"/>
         <w:rPr>
           <w:rFonts w:ascii="Arial" w:hAnsi="Arial" w:cs="Arial"/>
           <w:color w:val="000000" w:themeColor="text1"/>
@@ -9428,7 +9452,15 @@
     <w:p>
       <w:pPr>
         <w:spacing w:line="360" w:lineRule="auto"/>
-        <w:ind w:firstLine="720"/>
+        <w:rPr>
+          <w:rFonts w:ascii="Arial" w:hAnsi="Arial" w:cs="Arial"/>
+          <w:color w:val="000000" w:themeColor="text1"/>
+        </w:rPr>
+      </w:pPr>
+    </w:p>
+    <w:p>
+      <w:pPr>
+        <w:spacing w:line="360" w:lineRule="auto"/>
         <w:rPr>
           <w:rFonts w:ascii="Arial" w:hAnsi="Arial" w:cs="Arial"/>
           <w:color w:val="000000" w:themeColor="text1"/>
@@ -10330,6 +10362,7 @@
           <w:sz w:val="22"/>
           <w:szCs w:val="22"/>
         </w:rPr>
+        <w:lastRenderedPageBreak/>
         <w:t>B.5 Resources and Costs</w:t>
       </w:r>
       <w:bookmarkEnd w:id="21"/>
@@ -10366,7 +10399,6 @@
         <w:rPr>
           <w:rFonts w:ascii="Arial" w:hAnsi="Arial" w:cs="Arial"/>
         </w:rPr>
-        <w:lastRenderedPageBreak/>
         <w:t>Hardware i</w:t>
       </w:r>
       <w:r>
@@ -10709,7 +10741,6 @@
     <w:p>
       <w:pPr>
         <w:spacing w:line="360" w:lineRule="auto"/>
-        <w:ind w:firstLine="720"/>
         <w:rPr>
           <w:rFonts w:ascii="Arial" w:hAnsi="Arial" w:cs="Arial"/>
           <w:color w:val="000000" w:themeColor="text1"/>
@@ -11068,7 +11099,15 @@
           <w:rFonts w:ascii="Arial" w:hAnsi="Arial" w:cs="Arial"/>
           <w:color w:val="000000" w:themeColor="text1"/>
         </w:rPr>
-        <w:t xml:space="preserve">rately summarizes the methodology, presents the analytical findings with supporting visualizations, and provides at least </w:t>
+        <w:t xml:space="preserve">rately summarizes the methodology, presents the analytical findings with supporting </w:t>
+      </w:r>
+      <w:r>
+        <w:rPr>
+          <w:rFonts w:ascii="Arial" w:hAnsi="Arial" w:cs="Arial"/>
+          <w:color w:val="000000" w:themeColor="text1"/>
+        </w:rPr>
+        <w:lastRenderedPageBreak/>
+        <w:t xml:space="preserve">visualizations, and provides at least </w:t>
       </w:r>
       <w:r>
         <w:rPr>
@@ -11150,7 +11189,6 @@
     <w:p>
       <w:pPr>
         <w:spacing w:line="360" w:lineRule="auto"/>
-        <w:ind w:firstLine="720"/>
         <w:rPr>
           <w:rFonts w:ascii="Arial" w:hAnsi="Arial" w:cs="Arial"/>
           <w:color w:val="000000" w:themeColor="text1"/>
@@ -11311,7 +11349,6 @@
           <w:rFonts w:ascii="Arial" w:hAnsi="Arial" w:cs="Arial"/>
           <w:color w:val="000000" w:themeColor="text1"/>
         </w:rPr>
-        <w:tab/>
         <w:t xml:space="preserve">This project </w:t>
       </w:r>
       <w:r>
@@ -11630,13 +11667,6 @@
           <w:rFonts w:ascii="Arial" w:hAnsi="Arial" w:cs="Arial"/>
           <w:color w:val="000000" w:themeColor="text1"/>
         </w:rPr>
-        <w:tab/>
-      </w:r>
-      <w:r>
-        <w:rPr>
-          <w:rFonts w:ascii="Arial" w:hAnsi="Arial" w:cs="Arial"/>
-          <w:color w:val="000000" w:themeColor="text1"/>
-        </w:rPr>
         <w:t xml:space="preserve">A random forest classifier was selected for this project for several reasons. First, </w:t>
       </w:r>
       <w:r>
@@ -11658,14 +11688,7 @@
           <w:rFonts w:ascii="Arial" w:hAnsi="Arial" w:cs="Arial"/>
           <w:color w:val="000000" w:themeColor="text1"/>
         </w:rPr>
-        <w:t>forests are well-suited for multiclass classification and handle both categorical and numerical predictor variables effectively, which is important because this project includes a mix of encoded categorical features,</w:t>
-      </w:r>
-      <w:r>
-        <w:rPr>
-          <w:rFonts w:ascii="Arial" w:hAnsi="Arial" w:cs="Arial"/>
-          <w:color w:val="000000" w:themeColor="text1"/>
-        </w:rPr>
-        <w:t xml:space="preserve"> such as breed and color, </w:t>
+        <w:t xml:space="preserve">forests are well-suited for multiclass classification and handle </w:t>
       </w:r>
       <w:r>
         <w:rPr>
@@ -11673,7 +11696,14 @@
           <w:color w:val="000000" w:themeColor="text1"/>
         </w:rPr>
         <w:lastRenderedPageBreak/>
-        <w:t>as well as numerical features,</w:t>
+        <w:t>both categorical and numerical predictor variables effectively, which is important because this project includes a mix of encoded categorical features,</w:t>
+      </w:r>
+      <w:r>
+        <w:rPr>
+          <w:rFonts w:ascii="Arial" w:hAnsi="Arial" w:cs="Arial"/>
+          <w:color w:val="000000" w:themeColor="text1"/>
+        </w:rPr>
+        <w:t xml:space="preserve"> such as breed and color, as well as numerical features,</w:t>
       </w:r>
       <w:r>
         <w:rPr>
@@ -12382,112 +12412,136 @@
         <w:spacing w:line="360" w:lineRule="auto"/>
         <w:rPr>
           <w:rFonts w:ascii="Arial" w:hAnsi="Arial" w:cs="Arial"/>
+        </w:rPr>
+      </w:pPr>
+    </w:p>
+    <w:p>
+      <w:pPr>
+        <w:spacing w:line="360" w:lineRule="auto"/>
+        <w:rPr>
+          <w:rFonts w:ascii="Arial" w:hAnsi="Arial" w:cs="Arial"/>
+        </w:rPr>
+      </w:pPr>
+      <w:r>
+        <w:rPr>
+          <w:rFonts w:ascii="Arial" w:hAnsi="Arial" w:cs="Arial"/>
           <w:b/>
           <w:bCs/>
         </w:rPr>
-      </w:pPr>
+        <w:t>Model Type</w:t>
+      </w:r>
       <w:r>
         <w:rPr>
           <w:rFonts w:ascii="Arial" w:hAnsi="Arial" w:cs="Arial"/>
           <w:b/>
           <w:bCs/>
         </w:rPr>
-        <w:t>Model Type</w:t>
-      </w:r>
-      <w:r>
+        <w:t xml:space="preserve"> </w:t>
+      </w:r>
+      <w:r>
+        <w:rPr>
+          <w:rFonts w:ascii="Arial" w:hAnsi="Arial" w:cs="Arial"/>
+        </w:rPr>
+        <w:t xml:space="preserve">-- </w:t>
+      </w:r>
+      <w:r>
+        <w:rPr>
+          <w:rFonts w:ascii="Arial" w:hAnsi="Arial" w:cs="Arial"/>
+        </w:rPr>
+        <w:t xml:space="preserve">This project uses a multi-class classification model. The outcome variable, adoption result, </w:t>
+      </w:r>
+      <w:r>
+        <w:rPr>
+          <w:rFonts w:ascii="Arial" w:hAnsi="Arial" w:cs="Arial"/>
+        </w:rPr>
+        <w:t>contains 4 discrete categories: Adopted, Transferred, Returned to Owner, and Other. Supervised classification is appro</w:t>
+      </w:r>
+      <w:r>
+        <w:rPr>
+          <w:rFonts w:ascii="Arial" w:hAnsi="Arial" w:cs="Arial"/>
+        </w:rPr>
+        <w:t xml:space="preserve">priate because the goal is to predict category membership on labeled </w:t>
+      </w:r>
+      <w:r>
+        <w:rPr>
+          <w:rFonts w:ascii="Arial" w:hAnsi="Arial" w:cs="Arial"/>
+        </w:rPr>
+        <w:t>historical data.</w:t>
+      </w:r>
+    </w:p>
+    <w:p>
+      <w:pPr>
+        <w:spacing w:line="360" w:lineRule="auto"/>
         <w:rPr>
           <w:rFonts w:ascii="Arial" w:hAnsi="Arial" w:cs="Arial"/>
           <w:b/>
           <w:bCs/>
         </w:rPr>
-        <w:t xml:space="preserve"> </w:t>
-      </w:r>
-      <w:r>
-        <w:rPr>
-          <w:rFonts w:ascii="Arial" w:hAnsi="Arial" w:cs="Arial"/>
-        </w:rPr>
-        <w:t xml:space="preserve">-- </w:t>
-      </w:r>
-      <w:r>
-        <w:rPr>
-          <w:rFonts w:ascii="Arial" w:hAnsi="Arial" w:cs="Arial"/>
-        </w:rPr>
-        <w:t xml:space="preserve">This project uses a multi-class classification model. The outcome variable, adoption result, </w:t>
-      </w:r>
-      <w:r>
-        <w:rPr>
-          <w:rFonts w:ascii="Arial" w:hAnsi="Arial" w:cs="Arial"/>
-        </w:rPr>
-        <w:t>contains 4 discrete categories: Adopted, Transferred, Returned to Owner, and Other. Supervised classification is appro</w:t>
-      </w:r>
-      <w:r>
-        <w:rPr>
-          <w:rFonts w:ascii="Arial" w:hAnsi="Arial" w:cs="Arial"/>
-        </w:rPr>
-        <w:t xml:space="preserve">priate because the goal is to predict category membership on labeled </w:t>
-      </w:r>
-      <w:r>
-        <w:rPr>
-          <w:rFonts w:ascii="Arial" w:hAnsi="Arial" w:cs="Arial"/>
-        </w:rPr>
-        <w:t>historical data.</w:t>
-      </w:r>
+      </w:pPr>
     </w:p>
     <w:p>
       <w:pPr>
         <w:spacing w:line="360" w:lineRule="auto"/>
+        <w:rPr>
+          <w:rFonts w:ascii="Arial" w:hAnsi="Arial" w:cs="Arial"/>
+        </w:rPr>
+      </w:pPr>
+      <w:r>
         <w:rPr>
           <w:rFonts w:ascii="Arial" w:hAnsi="Arial" w:cs="Arial"/>
           <w:b/>
           <w:bCs/>
         </w:rPr>
-      </w:pPr>
+        <w:t>Algorithm</w:t>
+      </w:r>
+      <w:r>
+        <w:rPr>
+          <w:rFonts w:ascii="Arial" w:hAnsi="Arial" w:cs="Arial"/>
+        </w:rPr>
+        <w:t xml:space="preserve"> --</w:t>
+      </w:r>
       <w:r>
         <w:rPr>
           <w:rFonts w:ascii="Arial" w:hAnsi="Arial" w:cs="Arial"/>
           <w:b/>
           <w:bCs/>
         </w:rPr>
-        <w:t>Algorithm</w:t>
-      </w:r>
-      <w:r>
-        <w:rPr>
-          <w:rFonts w:ascii="Arial" w:hAnsi="Arial" w:cs="Arial"/>
-        </w:rPr>
-        <w:t xml:space="preserve"> --</w:t>
-      </w:r>
-      <w:r>
+        <w:t xml:space="preserve"> </w:t>
+      </w:r>
+      <w:r>
+        <w:rPr>
+          <w:rFonts w:ascii="Arial" w:hAnsi="Arial" w:cs="Arial"/>
+        </w:rPr>
+        <w:t xml:space="preserve">The random forest classifier, implemented using </w:t>
+      </w:r>
+      <w:r>
+        <w:rPr>
+          <w:rFonts w:ascii="Arial" w:hAnsi="Arial" w:cs="Arial"/>
+        </w:rPr>
+        <w:t>Python’s scikit-learn library, was used to develop the model. This al</w:t>
+      </w:r>
+      <w:r>
+        <w:rPr>
+          <w:rFonts w:ascii="Arial" w:hAnsi="Arial" w:cs="Arial"/>
+        </w:rPr>
+        <w:t xml:space="preserve">gorithm built 100 decision trees during training, each using a random subset of </w:t>
+      </w:r>
+      <w:r>
+        <w:rPr>
+          <w:rFonts w:ascii="Arial" w:hAnsi="Arial" w:cs="Arial"/>
+        </w:rPr>
+        <w:t>features and records. Final predictions are determined by majority vote across all trees.</w:t>
+      </w:r>
+    </w:p>
+    <w:p>
+      <w:pPr>
+        <w:spacing w:line="360" w:lineRule="auto"/>
         <w:rPr>
           <w:rFonts w:ascii="Arial" w:hAnsi="Arial" w:cs="Arial"/>
           <w:b/>
           <w:bCs/>
         </w:rPr>
-        <w:t xml:space="preserve"> </w:t>
-      </w:r>
-      <w:r>
-        <w:rPr>
-          <w:rFonts w:ascii="Arial" w:hAnsi="Arial" w:cs="Arial"/>
-        </w:rPr>
-        <w:t xml:space="preserve">The random forest classifier, implemented using </w:t>
-      </w:r>
-      <w:r>
-        <w:rPr>
-          <w:rFonts w:ascii="Arial" w:hAnsi="Arial" w:cs="Arial"/>
-        </w:rPr>
-        <w:t>Python’s scikit-learn library, was used to develop the model. This al</w:t>
-      </w:r>
-      <w:r>
-        <w:rPr>
-          <w:rFonts w:ascii="Arial" w:hAnsi="Arial" w:cs="Arial"/>
-        </w:rPr>
-        <w:t xml:space="preserve">gorithm built 100 decision trees during training, each using a random subset of </w:t>
-      </w:r>
-      <w:r>
-        <w:rPr>
-          <w:rFonts w:ascii="Arial" w:hAnsi="Arial" w:cs="Arial"/>
-        </w:rPr>
-        <w:t>features and records. Final predictions are determined by majority vote across all trees.</w:t>
-      </w:r>
+      </w:pPr>
     </w:p>
     <w:p>
       <w:pPr>
@@ -12696,101 +12750,122 @@
     </w:p>
     <w:p>
       <w:pPr>
+        <w:pStyle w:val="ListParagraph"/>
+        <w:numPr>
+          <w:ilvl w:val="0"/>
+          <w:numId w:val="24"/>
+        </w:numPr>
         <w:spacing w:line="360" w:lineRule="auto"/>
+        <w:rPr>
+          <w:rFonts w:ascii="Arial" w:hAnsi="Arial" w:cs="Arial"/>
+        </w:rPr>
+      </w:pPr>
+    </w:p>
+    <w:p>
+      <w:pPr>
+        <w:spacing w:line="360" w:lineRule="auto"/>
+        <w:rPr>
+          <w:rFonts w:ascii="Arial" w:hAnsi="Arial" w:cs="Arial"/>
+        </w:rPr>
+      </w:pPr>
+      <w:r>
         <w:rPr>
           <w:rFonts w:ascii="Arial" w:hAnsi="Arial" w:cs="Arial"/>
           <w:b/>
           <w:bCs/>
         </w:rPr>
-      </w:pPr>
+        <w:t>Benchmark for Success</w:t>
+      </w:r>
       <w:r>
         <w:rPr>
           <w:rFonts w:ascii="Arial" w:hAnsi="Arial" w:cs="Arial"/>
           <w:b/>
           <w:bCs/>
         </w:rPr>
-        <w:t>Benchmark for Success</w:t>
-      </w:r>
-      <w:r>
+        <w:t xml:space="preserve"> </w:t>
+      </w:r>
+      <w:r>
+        <w:rPr>
+          <w:rFonts w:ascii="Arial" w:hAnsi="Arial" w:cs="Arial"/>
+        </w:rPr>
+        <w:t xml:space="preserve">-- </w:t>
+      </w:r>
+      <w:r>
+        <w:rPr>
+          <w:rFonts w:ascii="Arial" w:hAnsi="Arial" w:cs="Arial"/>
+        </w:rPr>
+        <w:t xml:space="preserve">The model is considered successful if it achieves </w:t>
+      </w:r>
+      <w:r>
+        <w:rPr>
+          <w:rFonts w:ascii="Arial" w:hAnsi="Arial" w:cs="Arial"/>
+        </w:rPr>
+        <w:t xml:space="preserve">an overall accuracy of 70% or higher </w:t>
+      </w:r>
+      <w:r>
+        <w:rPr>
+          <w:rFonts w:ascii="Arial" w:hAnsi="Arial" w:cs="Arial"/>
+        </w:rPr>
+        <w:t xml:space="preserve">on </w:t>
+      </w:r>
+      <w:r>
+        <w:rPr>
+          <w:rFonts w:ascii="Arial" w:hAnsi="Arial" w:cs="Arial"/>
+        </w:rPr>
+        <w:t>the test dataset</w:t>
+      </w:r>
+      <w:r>
+        <w:rPr>
+          <w:rFonts w:ascii="Arial" w:hAnsi="Arial" w:cs="Arial"/>
+        </w:rPr>
+        <w:t xml:space="preserve">. This benchmark represents </w:t>
+      </w:r>
+      <w:r>
+        <w:rPr>
+          <w:rFonts w:ascii="Arial" w:hAnsi="Arial" w:cs="Arial"/>
+        </w:rPr>
+        <w:t xml:space="preserve">a </w:t>
+      </w:r>
+      <w:r>
+        <w:rPr>
+          <w:rFonts w:ascii="Arial" w:hAnsi="Arial" w:cs="Arial"/>
+        </w:rPr>
+        <w:t>meaningful improve</w:t>
+      </w:r>
+      <w:r>
+        <w:rPr>
+          <w:rFonts w:ascii="Arial" w:hAnsi="Arial" w:cs="Arial"/>
+        </w:rPr>
+        <w:t xml:space="preserve">ment over random chance (25% for 4 classes) and exceeds prior research </w:t>
+      </w:r>
+      <w:r>
+        <w:rPr>
+          <w:rFonts w:ascii="Arial" w:hAnsi="Arial" w:cs="Arial"/>
+        </w:rPr>
+        <w:t>using the same dataset (65.33% accuracy)</w:t>
+      </w:r>
+      <w:r>
+        <w:rPr>
+          <w:rFonts w:ascii="Arial" w:hAnsi="Arial" w:cs="Arial"/>
+        </w:rPr>
+        <w:t>. An F1-score of 0.60 or higher for the Adopted category serves as a secondary benc</w:t>
+      </w:r>
+      <w:r>
+        <w:rPr>
+          <w:rFonts w:ascii="Arial" w:hAnsi="Arial" w:cs="Arial"/>
+        </w:rPr>
+        <w:t>hmark.</w:t>
+      </w:r>
+    </w:p>
+    <w:p>
+      <w:pPr>
+        <w:spacing w:line="360" w:lineRule="auto"/>
         <w:rPr>
           <w:rFonts w:ascii="Arial" w:hAnsi="Arial" w:cs="Arial"/>
           <w:b/>
           <w:bCs/>
         </w:rPr>
-        <w:t xml:space="preserve"> </w:t>
-      </w:r>
-      <w:r>
-        <w:rPr>
-          <w:rFonts w:ascii="Arial" w:hAnsi="Arial" w:cs="Arial"/>
-        </w:rPr>
-        <w:t xml:space="preserve">-- </w:t>
-      </w:r>
-      <w:r>
-        <w:rPr>
-          <w:rFonts w:ascii="Arial" w:hAnsi="Arial" w:cs="Arial"/>
-        </w:rPr>
-        <w:t xml:space="preserve">The model is considered successful if it achieves </w:t>
-      </w:r>
-      <w:r>
-        <w:rPr>
-          <w:rFonts w:ascii="Arial" w:hAnsi="Arial" w:cs="Arial"/>
-        </w:rPr>
-        <w:t xml:space="preserve">an overall accuracy of 70% or higher </w:t>
-      </w:r>
-      <w:r>
-        <w:rPr>
-          <w:rFonts w:ascii="Arial" w:hAnsi="Arial" w:cs="Arial"/>
-        </w:rPr>
-        <w:t xml:space="preserve">on </w:t>
-      </w:r>
-      <w:r>
-        <w:rPr>
-          <w:rFonts w:ascii="Arial" w:hAnsi="Arial" w:cs="Arial"/>
-        </w:rPr>
-        <w:t>the test dataset</w:t>
-      </w:r>
-      <w:r>
-        <w:rPr>
-          <w:rFonts w:ascii="Arial" w:hAnsi="Arial" w:cs="Arial"/>
-        </w:rPr>
-        <w:t xml:space="preserve">. This benchmark represents </w:t>
-      </w:r>
-      <w:r>
-        <w:rPr>
-          <w:rFonts w:ascii="Arial" w:hAnsi="Arial" w:cs="Arial"/>
-        </w:rPr>
-        <w:t xml:space="preserve">a </w:t>
-      </w:r>
-      <w:r>
-        <w:rPr>
-          <w:rFonts w:ascii="Arial" w:hAnsi="Arial" w:cs="Arial"/>
-        </w:rPr>
-        <w:t>meaningful improve</w:t>
-      </w:r>
-      <w:r>
-        <w:rPr>
-          <w:rFonts w:ascii="Arial" w:hAnsi="Arial" w:cs="Arial"/>
-        </w:rPr>
-        <w:t xml:space="preserve">ment over random chance (25% for 4 classes) and exceeds prior research </w:t>
-      </w:r>
-      <w:r>
-        <w:rPr>
-          <w:rFonts w:ascii="Arial" w:hAnsi="Arial" w:cs="Arial"/>
-        </w:rPr>
-        <w:t>using the same dataset (65.33% accuracy)</w:t>
-      </w:r>
-      <w:r>
-        <w:rPr>
-          <w:rFonts w:ascii="Arial" w:hAnsi="Arial" w:cs="Arial"/>
-        </w:rPr>
-        <w:t>. An F1-score of 0.60 or higher for the Adopted category serves as a secondary benc</w:t>
-      </w:r>
-      <w:r>
-        <w:rPr>
-          <w:rFonts w:ascii="Arial" w:hAnsi="Arial" w:cs="Arial"/>
-        </w:rPr>
-        <w:t>hmark.</w:t>
-      </w:r>
+      </w:pPr>
     </w:p>
     <w:p>
       <w:pPr>
@@ -12807,6 +12882,7 @@
           <w:b/>
           <w:bCs/>
         </w:rPr>
+        <w:lastRenderedPageBreak/>
         <w:t>Alpha Value</w:t>
       </w:r>
       <w:r>
@@ -12845,7 +12921,21 @@
         <w:rPr>
           <w:rFonts w:ascii="Arial" w:hAnsi="Arial" w:cs="Arial"/>
         </w:rPr>
-        <w:t xml:space="preserve">outcome. Features with importance scores greater than 0.05 (accounting for </w:t>
+        <w:t xml:space="preserve">outcome. Features with </w:t>
+      </w:r>
+      <w:proofErr w:type="gramStart"/>
+      <w:r>
+        <w:rPr>
+          <w:rFonts w:ascii="Arial" w:hAnsi="Arial" w:cs="Arial"/>
+        </w:rPr>
+        <w:t>importance</w:t>
+      </w:r>
+      <w:proofErr w:type="gramEnd"/>
+      <w:r>
+        <w:rPr>
+          <w:rFonts w:ascii="Arial" w:hAnsi="Arial" w:cs="Arial"/>
+        </w:rPr>
+        <w:t xml:space="preserve"> scores greater than 0.05 (accounting for </w:t>
       </w:r>
       <w:r>
         <w:rPr>
@@ -12877,7 +12967,6 @@
           <w:b/>
           <w:bCs/>
         </w:rPr>
-        <w:lastRenderedPageBreak/>
         <w:t>C.4.A</w:t>
       </w:r>
       <w:r>
@@ -12899,80 +12988,72 @@
       <w:r>
         <w:rPr>
           <w:rFonts w:ascii="Arial" w:hAnsi="Arial" w:cs="Arial"/>
+        </w:rPr>
+        <w:t>The random forest classifier is app</w:t>
+      </w:r>
+      <w:r>
+        <w:rPr>
+          <w:rFonts w:ascii="Arial" w:hAnsi="Arial" w:cs="Arial"/>
+        </w:rPr>
+        <w:t xml:space="preserve">ropriate because the outcome </w:t>
+      </w:r>
+      <w:r>
+        <w:rPr>
+          <w:rFonts w:ascii="Arial" w:hAnsi="Arial" w:cs="Arial"/>
+        </w:rPr>
+        <w:t xml:space="preserve">has 4 discrete categories and mixed data types (categorical variables, such as breed and color, and numerical variables, such as age and length of stay). The ensemble approach </w:t>
+      </w:r>
+      <w:r>
+        <w:rPr>
+          <w:rFonts w:ascii="Arial" w:hAnsi="Arial" w:cs="Arial"/>
+        </w:rPr>
+        <w:t>makes it robust and less prone to overfitting than single decision trees</w:t>
+      </w:r>
+      <w:r>
+        <w:rPr>
+          <w:rFonts w:ascii="Arial" w:hAnsi="Arial" w:cs="Arial"/>
+        </w:rPr>
+        <w:t xml:space="preserve">. Accuracy provides an intuitive overall measure for shelter </w:t>
+      </w:r>
+      <w:r>
+        <w:rPr>
+          <w:rFonts w:ascii="Arial" w:hAnsi="Arial" w:cs="Arial"/>
+        </w:rPr>
+        <w:t xml:space="preserve">administrators, while precision, recall, and F1-score </w:t>
+      </w:r>
+      <w:r>
+        <w:rPr>
+          <w:rFonts w:ascii="Arial" w:hAnsi="Arial" w:cs="Arial"/>
+        </w:rPr>
+        <w:t xml:space="preserve">address class imbalance. The confusion matrix </w:t>
+      </w:r>
+      <w:r>
+        <w:rPr>
+          <w:rFonts w:ascii="Arial" w:hAnsi="Arial" w:cs="Arial"/>
+        </w:rPr>
+        <w:t>identifies specific prediction errors, and the 70% acc</w:t>
+      </w:r>
+      <w:r>
+        <w:rPr>
+          <w:rFonts w:ascii="Arial" w:hAnsi="Arial" w:cs="Arial"/>
+        </w:rPr>
+        <w:t>uracy benchmark aligns with prior research while demonstrating gen</w:t>
+      </w:r>
+      <w:r>
+        <w:rPr>
+          <w:rFonts w:ascii="Arial" w:hAnsi="Arial" w:cs="Arial"/>
+        </w:rPr>
+        <w:t>uine predictive value.</w:t>
+      </w:r>
+    </w:p>
+    <w:p>
+      <w:pPr>
+        <w:spacing w:line="360" w:lineRule="auto"/>
+        <w:rPr>
+          <w:rFonts w:ascii="Arial" w:hAnsi="Arial" w:cs="Arial"/>
           <w:b/>
           <w:bCs/>
         </w:rPr>
-        <w:tab/>
-      </w:r>
-      <w:r>
-        <w:rPr>
-          <w:rFonts w:ascii="Arial" w:hAnsi="Arial" w:cs="Arial"/>
-        </w:rPr>
-        <w:t>The random forest classifier is app</w:t>
-      </w:r>
-      <w:r>
-        <w:rPr>
-          <w:rFonts w:ascii="Arial" w:hAnsi="Arial" w:cs="Arial"/>
-        </w:rPr>
-        <w:t xml:space="preserve">ropriate because the outcome </w:t>
-      </w:r>
-      <w:r>
-        <w:rPr>
-          <w:rFonts w:ascii="Arial" w:hAnsi="Arial" w:cs="Arial"/>
-        </w:rPr>
-        <w:t xml:space="preserve">has 4 discrete categories and mixed data types (categorical variables, such as breed and color, and numerical variables, such as age and length of stay). The ensemble approach </w:t>
-      </w:r>
-      <w:r>
-        <w:rPr>
-          <w:rFonts w:ascii="Arial" w:hAnsi="Arial" w:cs="Arial"/>
-        </w:rPr>
-        <w:t>makes it robust and less prone to overfitting than single decision trees</w:t>
-      </w:r>
-      <w:r>
-        <w:rPr>
-          <w:rFonts w:ascii="Arial" w:hAnsi="Arial" w:cs="Arial"/>
-        </w:rPr>
-        <w:t xml:space="preserve">. Accuracy provides an intuitive overall measure for shelter </w:t>
-      </w:r>
-      <w:r>
-        <w:rPr>
-          <w:rFonts w:ascii="Arial" w:hAnsi="Arial" w:cs="Arial"/>
-        </w:rPr>
-        <w:t xml:space="preserve">administrators, while precision, recall, and F1-score </w:t>
-      </w:r>
-      <w:r>
-        <w:rPr>
-          <w:rFonts w:ascii="Arial" w:hAnsi="Arial" w:cs="Arial"/>
-        </w:rPr>
-        <w:t xml:space="preserve">address class imbalance. The confusion matrix </w:t>
-      </w:r>
-      <w:r>
-        <w:rPr>
-          <w:rFonts w:ascii="Arial" w:hAnsi="Arial" w:cs="Arial"/>
-        </w:rPr>
-        <w:t>identifies specific prediction errors, and the 70% acc</w:t>
-      </w:r>
-      <w:r>
-        <w:rPr>
-          <w:rFonts w:ascii="Arial" w:hAnsi="Arial" w:cs="Arial"/>
-        </w:rPr>
-        <w:t>uracy benchmark aligns with prior research while demonstrating gen</w:t>
-      </w:r>
-      <w:r>
-        <w:rPr>
-          <w:rFonts w:ascii="Arial" w:hAnsi="Arial" w:cs="Arial"/>
-        </w:rPr>
-        <w:t>uine predictive value.</w:t>
-      </w:r>
-    </w:p>
-    <w:p>
-      <w:pPr>
-        <w:spacing w:line="360" w:lineRule="auto"/>
-        <w:rPr>
-          <w:rFonts w:ascii="Arial" w:hAnsi="Arial" w:cs="Arial"/>
-          <w:b/>
-          <w:bCs/>
-        </w:rPr>
       </w:pPr>
     </w:p>
     <w:p>
@@ -13009,7 +13090,6 @@
         <w:rPr>
           <w:rFonts w:ascii="Arial" w:hAnsi="Arial" w:cs="Arial"/>
         </w:rPr>
-        <w:tab/>
         <w:t xml:space="preserve">The </w:t>
       </w:r>
       <w:r>
@@ -13214,54 +13294,13 @@
     </w:p>
     <w:p>
       <w:pPr>
+        <w:pStyle w:val="ListParagraph"/>
         <w:spacing w:line="360" w:lineRule="auto"/>
-        <w:ind w:left="418" w:firstLine="302"/>
-        <w:rPr>
-          <w:rFonts w:ascii="Arial" w:hAnsi="Arial" w:cs="Arial"/>
-        </w:rPr>
-      </w:pPr>
-      <w:r>
-        <w:rPr>
-          <w:rFonts w:ascii="Arial" w:hAnsi="Arial" w:cs="Arial"/>
-        </w:rPr>
-        <w:t>For example, an adult dark-coated cat admitted as an owner-surrender would be flagged as higher risk based on this project</w:t>
-      </w:r>
-      <w:r>
-        <w:rPr>
-          <w:rFonts w:ascii="Arial" w:hAnsi="Arial" w:cs="Arial"/>
-        </w:rPr>
-        <w:t xml:space="preserve">’s top predictors (age, color, intake type). Shelter administrators </w:t>
-      </w:r>
-      <w:r>
-        <w:rPr>
-          <w:rFonts w:ascii="Arial" w:hAnsi="Arial" w:cs="Arial"/>
-        </w:rPr>
-        <w:t xml:space="preserve">could immediately prioritize that animal for foster placement, enhanced social media promotion, </w:t>
-      </w:r>
-      <w:r>
-        <w:rPr>
-          <w:rFonts w:ascii="Arial" w:hAnsi="Arial" w:cs="Arial"/>
-        </w:rPr>
-        <w:t xml:space="preserve">or </w:t>
-      </w:r>
-      <w:r>
-        <w:rPr>
-          <w:rFonts w:ascii="Arial" w:hAnsi="Arial" w:cs="Arial"/>
-        </w:rPr>
-        <w:t>adoption</w:t>
-      </w:r>
-      <w:r>
-        <w:rPr>
-          <w:rFonts w:ascii="Arial" w:hAnsi="Arial" w:cs="Arial"/>
-        </w:rPr>
-        <w:t xml:space="preserve"> event inclusion, preventing the accumulation of long length of stay, which the model identified as the strongest </w:t>
-      </w:r>
-      <w:r>
-        <w:rPr>
-          <w:rFonts w:ascii="Arial" w:hAnsi="Arial" w:cs="Arial"/>
-        </w:rPr>
-        <w:t>predictor of poor outcomes.</w:t>
-      </w:r>
+        <w:ind w:left="778"/>
+        <w:rPr>
+          <w:rFonts w:ascii="Arial" w:hAnsi="Arial" w:cs="Arial"/>
+        </w:rPr>
+      </w:pPr>
     </w:p>
     <w:p>
       <w:pPr>
@@ -13275,20 +13314,57 @@
         <w:rPr>
           <w:rFonts w:ascii="Arial" w:hAnsi="Arial" w:cs="Arial"/>
         </w:rPr>
-        <w:tab/>
-        <w:t xml:space="preserve">This early targeted intervention </w:t>
-      </w:r>
-      <w:r>
-        <w:rPr>
-          <w:rFonts w:ascii="Arial" w:hAnsi="Arial" w:cs="Arial"/>
-        </w:rPr>
-        <w:t>directly addresses the organizational need described in Section A1 and demonstrates the operational value of data</w:t>
-      </w:r>
-      <w:r>
-        <w:rPr>
-          <w:rFonts w:ascii="Arial" w:hAnsi="Arial" w:cs="Arial"/>
-        </w:rPr>
-        <w:t>-driven decision-making for a resource-constrained shelter.</w:t>
+        <w:t>For example, an adult dark-coated cat admitted as an owner-surrender would be flagged as higher risk based on this project</w:t>
+      </w:r>
+      <w:r>
+        <w:rPr>
+          <w:rFonts w:ascii="Arial" w:hAnsi="Arial" w:cs="Arial"/>
+        </w:rPr>
+        <w:t xml:space="preserve">’s top predictors (age, color, </w:t>
+      </w:r>
+      <w:proofErr w:type="gramStart"/>
+      <w:r>
+        <w:rPr>
+          <w:rFonts w:ascii="Arial" w:hAnsi="Arial" w:cs="Arial"/>
+        </w:rPr>
+        <w:t>intake type</w:t>
+      </w:r>
+      <w:proofErr w:type="gramEnd"/>
+      <w:r>
+        <w:rPr>
+          <w:rFonts w:ascii="Arial" w:hAnsi="Arial" w:cs="Arial"/>
+        </w:rPr>
+        <w:t xml:space="preserve">). Shelter administrators </w:t>
+      </w:r>
+      <w:r>
+        <w:rPr>
+          <w:rFonts w:ascii="Arial" w:hAnsi="Arial" w:cs="Arial"/>
+        </w:rPr>
+        <w:t xml:space="preserve">could immediately prioritize that animal for foster placement, enhanced social media promotion, </w:t>
+      </w:r>
+      <w:r>
+        <w:rPr>
+          <w:rFonts w:ascii="Arial" w:hAnsi="Arial" w:cs="Arial"/>
+        </w:rPr>
+        <w:t xml:space="preserve">or </w:t>
+      </w:r>
+      <w:r>
+        <w:rPr>
+          <w:rFonts w:ascii="Arial" w:hAnsi="Arial" w:cs="Arial"/>
+        </w:rPr>
+        <w:t>adoption</w:t>
+      </w:r>
+      <w:r>
+        <w:rPr>
+          <w:rFonts w:ascii="Arial" w:hAnsi="Arial" w:cs="Arial"/>
+        </w:rPr>
+        <w:t xml:space="preserve"> event inclusion, preventing the accumulation of long length of stay, which the model identified as the strongest </w:t>
+      </w:r>
+      <w:r>
+        <w:rPr>
+          <w:rFonts w:ascii="Arial" w:hAnsi="Arial" w:cs="Arial"/>
+        </w:rPr>
+        <w:t>predictor of poor outcomes.</w:t>
       </w:r>
     </w:p>
     <w:p>
@@ -13299,6 +13375,34 @@
           <w:rFonts w:ascii="Arial" w:hAnsi="Arial" w:cs="Arial"/>
         </w:rPr>
       </w:pPr>
+      <w:r>
+        <w:rPr>
+          <w:rFonts w:ascii="Arial" w:hAnsi="Arial" w:cs="Arial"/>
+        </w:rPr>
+        <w:lastRenderedPageBreak/>
+        <w:t xml:space="preserve">This early targeted intervention </w:t>
+      </w:r>
+      <w:r>
+        <w:rPr>
+          <w:rFonts w:ascii="Arial" w:hAnsi="Arial" w:cs="Arial"/>
+        </w:rPr>
+        <w:t>directly addresses the organizational need described in Section A1 and demonstrates the operational value of data</w:t>
+      </w:r>
+      <w:r>
+        <w:rPr>
+          <w:rFonts w:ascii="Arial" w:hAnsi="Arial" w:cs="Arial"/>
+        </w:rPr>
+        <w:t>-driven decision-making for a resource-constrained shelter.</w:t>
+      </w:r>
+    </w:p>
+    <w:p>
+      <w:pPr>
+        <w:spacing w:line="360" w:lineRule="auto"/>
+        <w:ind w:left="418"/>
+        <w:rPr>
+          <w:rFonts w:ascii="Arial" w:hAnsi="Arial" w:cs="Arial"/>
+        </w:rPr>
+      </w:pPr>
     </w:p>
     <w:p>
       <w:pPr>
@@ -13319,7 +13423,6 @@
           <w:sz w:val="22"/>
           <w:szCs w:val="22"/>
         </w:rPr>
-        <w:lastRenderedPageBreak/>
         <w:t>C.6 Visual Communication</w:t>
       </w:r>
       <w:bookmarkEnd w:id="29"/>
@@ -13331,12 +13434,6 @@
           <w:rFonts w:ascii="Arial" w:hAnsi="Arial" w:cs="Arial"/>
         </w:rPr>
       </w:pPr>
-      <w:r>
-        <w:rPr>
-          <w:rFonts w:ascii="Arial" w:hAnsi="Arial" w:cs="Arial"/>
-        </w:rPr>
-        <w:tab/>
-      </w:r>
       <w:r>
         <w:rPr>
           <w:rFonts w:ascii="Arial" w:hAnsi="Arial" w:cs="Arial"/>
@@ -13571,7 +13668,21 @@
         <w:rPr>
           <w:rFonts w:ascii="Arial" w:hAnsi="Arial" w:cs="Arial"/>
         </w:rPr>
-        <w:t xml:space="preserve">across the 4 outcome categories. Highlights </w:t>
+        <w:t xml:space="preserve">across the 4 outcome categories. </w:t>
+      </w:r>
+      <w:proofErr w:type="gramStart"/>
+      <w:r>
+        <w:rPr>
+          <w:rFonts w:ascii="Arial" w:hAnsi="Arial" w:cs="Arial"/>
+        </w:rPr>
+        <w:t>Highlights</w:t>
+      </w:r>
+      <w:proofErr w:type="gramEnd"/>
+      <w:r>
+        <w:rPr>
+          <w:rFonts w:ascii="Arial" w:hAnsi="Arial" w:cs="Arial"/>
+        </w:rPr>
+        <w:t xml:space="preserve"> </w:t>
       </w:r>
       <w:r>
         <w:rPr>
@@ -13957,6 +14068,7 @@
           <w:b/>
           <w:bCs/>
         </w:rPr>
+        <w:lastRenderedPageBreak/>
         <w:t>Feature Importance</w:t>
       </w:r>
       <w:r>
@@ -14030,7 +14142,6 @@
           <w:sz w:val="22"/>
           <w:szCs w:val="22"/>
         </w:rPr>
-        <w:lastRenderedPageBreak/>
         <w:t xml:space="preserve">D. </w:t>
       </w:r>
       <w:r>
@@ -14086,7 +14197,6 @@
         <w:rPr>
           <w:rFonts w:ascii="Arial" w:hAnsi="Arial" w:cs="Arial"/>
         </w:rPr>
-        <w:tab/>
         <w:t xml:space="preserve">The data used in this project </w:t>
       </w:r>
       <w:r>
@@ -14230,12 +14340,6 @@
           <w:rFonts w:ascii="Arial" w:hAnsi="Arial" w:cs="Arial"/>
         </w:rPr>
       </w:pPr>
-      <w:r>
-        <w:rPr>
-          <w:rFonts w:ascii="Arial" w:hAnsi="Arial" w:cs="Arial"/>
-        </w:rPr>
-        <w:tab/>
-      </w:r>
       <w:r>
         <w:rPr>
           <w:rFonts w:ascii="Arial" w:hAnsi="Arial" w:cs="Arial"/>
@@ -14478,7 +14582,6 @@
         <w:rPr>
           <w:rFonts w:ascii="Arial" w:hAnsi="Arial" w:cs="Arial"/>
         </w:rPr>
-        <w:tab/>
         <w:t xml:space="preserve">The data for this project </w:t>
       </w:r>
       <w:r>
@@ -14509,7 +14612,14 @@
         <w:rPr>
           <w:rFonts w:ascii="Arial" w:hAnsi="Arial" w:cs="Arial"/>
         </w:rPr>
-        <w:t xml:space="preserve">s were accessed by navigating to their respective dataset pages, selecting the </w:t>
+        <w:t xml:space="preserve">s </w:t>
+      </w:r>
+      <w:r>
+        <w:rPr>
+          <w:rFonts w:ascii="Arial" w:hAnsi="Arial" w:cs="Arial"/>
+        </w:rPr>
+        <w:lastRenderedPageBreak/>
+        <w:t xml:space="preserve">were accessed by navigating to their respective dataset pages, selecting the </w:t>
       </w:r>
       <w:r>
         <w:rPr>
@@ -14529,7 +14639,6 @@
         <w:rPr>
           <w:rFonts w:ascii="Arial" w:hAnsi="Arial" w:cs="Arial"/>
         </w:rPr>
-        <w:tab/>
         <w:t xml:space="preserve">No surveys, interviews, observations, or human </w:t>
       </w:r>
       <w:r>
@@ -14574,8 +14683,6 @@
         <w:rPr>
           <w:rFonts w:ascii="Arial" w:hAnsi="Arial" w:cs="Arial"/>
         </w:rPr>
-        <w:lastRenderedPageBreak/>
-        <w:tab/>
         <w:t>The CSV files were loaded into Python using pandas</w:t>
       </w:r>
       <w:r>
@@ -14639,7 +14746,6 @@
         <w:rPr>
           <w:rFonts w:ascii="Arial" w:hAnsi="Arial" w:cs="Arial"/>
         </w:rPr>
-        <w:tab/>
         <w:t>The Austin Animal Center datasets</w:t>
       </w:r>
       <w:r>
@@ -14670,13 +14776,19 @@
         <w:rPr>
           <w:rFonts w:ascii="Arial" w:hAnsi="Arial" w:cs="Arial"/>
         </w:rPr>
-        <w:t xml:space="preserve"> formatting</w:t>
-      </w:r>
-      <w:r>
-        <w:rPr>
-          <w:rFonts w:ascii="Arial" w:hAnsi="Arial" w:cs="Arial"/>
-        </w:rPr>
-        <w:t xml:space="preserve">,  consistent column naming, and </w:t>
+        <w:t xml:space="preserve"> </w:t>
+      </w:r>
+      <w:r>
+        <w:rPr>
+          <w:rFonts w:ascii="Arial" w:hAnsi="Arial" w:cs="Arial"/>
+        </w:rPr>
+        <w:t>formatting, consistent</w:t>
+      </w:r>
+      <w:r>
+        <w:rPr>
+          <w:rFonts w:ascii="Arial" w:hAnsi="Arial" w:cs="Arial"/>
+        </w:rPr>
+        <w:t xml:space="preserve"> column naming, and </w:t>
       </w:r>
       <w:r>
         <w:rPr>
@@ -14757,12 +14869,6 @@
         <w:rPr>
           <w:rFonts w:ascii="Arial" w:hAnsi="Arial" w:cs="Arial"/>
         </w:rPr>
-        <w:t xml:space="preserve"> across</w:t>
-      </w:r>
-      <w:r>
-        <w:rPr>
-          <w:rFonts w:ascii="Arial" w:hAnsi="Arial" w:cs="Arial"/>
-        </w:rPr>
         <w:t xml:space="preserve"> </w:t>
       </w:r>
       <w:r>
@@ -14799,13 +14905,13 @@
         <w:rPr>
           <w:rFonts w:ascii="Arial" w:hAnsi="Arial" w:cs="Arial"/>
         </w:rPr>
-        <w:t xml:space="preserve"> -- </w:t>
-      </w:r>
-      <w:r>
-        <w:rPr>
-          <w:rFonts w:ascii="Arial" w:hAnsi="Arial" w:cs="Arial"/>
-        </w:rPr>
-        <w:t xml:space="preserve"> Name, Outcome Subtype,</w:t>
+        <w:t>--Name</w:t>
+      </w:r>
+      <w:r>
+        <w:rPr>
+          <w:rFonts w:ascii="Arial" w:hAnsi="Arial" w:cs="Arial"/>
+        </w:rPr>
+        <w:t>, Outcome Subtype,</w:t>
       </w:r>
       <w:r>
         <w:rPr>
@@ -14926,19 +15032,7 @@
         <w:rPr>
           <w:rFonts w:ascii="Arial" w:hAnsi="Arial" w:cs="Arial"/>
         </w:rPr>
-        <w:t xml:space="preserve"> -- </w:t>
-      </w:r>
-      <w:r>
-        <w:rPr>
-          <w:rFonts w:ascii="Arial" w:hAnsi="Arial" w:cs="Arial"/>
-        </w:rPr>
-        <w:t xml:space="preserve"> </w:t>
-      </w:r>
-      <w:r>
-        <w:rPr>
-          <w:rFonts w:ascii="Arial" w:hAnsi="Arial" w:cs="Arial"/>
-        </w:rPr>
-        <w:t>N</w:t>
+        <w:t>--N</w:t>
       </w:r>
       <w:r>
         <w:rPr>
@@ -15023,7 +15117,7 @@
         <w:rPr>
           <w:rFonts w:ascii="Arial" w:hAnsi="Arial" w:cs="Arial"/>
         </w:rPr>
-        <w:t xml:space="preserve">Data type conversions – Age upon Intake was converted from string formats to standardized numeric days for modeling. Outcome DateTime </w:t>
+        <w:t xml:space="preserve">Data type conversions–Age upon Intake was converted from string formats to standardized numeric days for modeling. Outcome DateTime </w:t>
       </w:r>
       <w:r>
         <w:rPr>
@@ -15163,17 +15257,118 @@
           <w:rFonts w:ascii="Arial" w:hAnsi="Arial" w:cs="Arial"/>
           <w:color w:val="000000" w:themeColor="text1"/>
         </w:rPr>
-        <w:t xml:space="preserve"> --</w:t>
-      </w:r>
-      <w:r>
+        <w:t xml:space="preserve"> — </w:t>
+      </w:r>
+      <w:r>
+        <w:rPr>
+          <w:rFonts w:ascii="Arial" w:hAnsi="Arial" w:cs="Arial"/>
+          <w:color w:val="000000" w:themeColor="text1"/>
+        </w:rPr>
+        <w:t>The Austin Animal Center Intake</w:t>
+      </w:r>
+      <w:r>
+        <w:rPr>
+          <w:rFonts w:ascii="Arial" w:hAnsi="Arial" w:cs="Arial"/>
+          <w:color w:val="000000" w:themeColor="text1"/>
+        </w:rPr>
+        <w:t>s</w:t>
+      </w:r>
+      <w:r>
+        <w:rPr>
+          <w:rFonts w:ascii="Arial" w:hAnsi="Arial" w:cs="Arial"/>
+          <w:color w:val="000000" w:themeColor="text1"/>
+        </w:rPr>
+        <w:t xml:space="preserve"> and Outcomes datasets are owned and maintained </w:t>
+      </w:r>
+      <w:r>
+        <w:rPr>
+          <w:rFonts w:ascii="Arial" w:hAnsi="Arial" w:cs="Arial"/>
+          <w:color w:val="000000" w:themeColor="text1"/>
+        </w:rPr>
+        <w:t>by</w:t>
+      </w:r>
+      <w:r>
+        <w:rPr>
+          <w:rFonts w:ascii="Arial" w:hAnsi="Arial" w:cs="Arial"/>
+          <w:color w:val="000000" w:themeColor="text1"/>
+        </w:rPr>
+        <w:t xml:space="preserve"> the City of Austin and </w:t>
+      </w:r>
+      <w:r>
+        <w:rPr>
+          <w:rFonts w:ascii="Arial" w:hAnsi="Arial" w:cs="Arial"/>
+          <w:color w:val="000000" w:themeColor="text1"/>
+        </w:rPr>
+        <w:t>published through the City of Austin Open Data Portal under an open public license</w:t>
+      </w:r>
+      <w:r>
+        <w:rPr>
+          <w:rFonts w:ascii="Arial" w:hAnsi="Arial" w:cs="Arial"/>
+          <w:color w:val="000000" w:themeColor="text1"/>
+        </w:rPr>
+        <w:t xml:space="preserve">. The City of Austin ensures data accuracy and updates. This </w:t>
+      </w:r>
+      <w:r>
+        <w:rPr>
+          <w:rFonts w:ascii="Arial" w:hAnsi="Arial" w:cs="Arial"/>
+          <w:color w:val="000000" w:themeColor="text1"/>
+        </w:rPr>
+        <w:lastRenderedPageBreak/>
+        <w:t xml:space="preserve">project used the data </w:t>
+      </w:r>
+      <w:r>
+        <w:rPr>
+          <w:rFonts w:ascii="Arial" w:hAnsi="Arial" w:cs="Arial"/>
+          <w:color w:val="000000" w:themeColor="text1"/>
+        </w:rPr>
+        <w:t xml:space="preserve">solely for academic research, in accordance with the open license terms, and the dataset was </w:t>
+      </w:r>
+      <w:r>
+        <w:rPr>
+          <w:rFonts w:ascii="Arial" w:hAnsi="Arial" w:cs="Arial"/>
+          <w:color w:val="000000" w:themeColor="text1"/>
+        </w:rPr>
+        <w:t xml:space="preserve">securely </w:t>
+      </w:r>
+      <w:r>
+        <w:rPr>
+          <w:rFonts w:ascii="Arial" w:hAnsi="Arial" w:cs="Arial"/>
+          <w:color w:val="000000" w:themeColor="text1"/>
+        </w:rPr>
+        <w:t xml:space="preserve">stored on </w:t>
+      </w:r>
+      <w:r>
+        <w:rPr>
+          <w:rFonts w:ascii="Arial" w:hAnsi="Arial" w:cs="Arial"/>
+          <w:color w:val="000000" w:themeColor="text1"/>
+        </w:rPr>
+        <w:t xml:space="preserve">the </w:t>
+      </w:r>
+      <w:r>
+        <w:rPr>
+          <w:rFonts w:ascii="Arial" w:hAnsi="Arial" w:cs="Arial"/>
+          <w:color w:val="000000" w:themeColor="text1"/>
+        </w:rPr>
+        <w:t>user’s laptop. No modifications were made to the source file</w:t>
+      </w:r>
+      <w:r>
+        <w:rPr>
+          <w:rFonts w:ascii="Arial" w:hAnsi="Arial" w:cs="Arial"/>
+          <w:color w:val="000000" w:themeColor="text1"/>
+        </w:rPr>
+        <w:t>s; all data cleaning was completed on copies and in a Python environment.</w:t>
+      </w:r>
+    </w:p>
+    <w:p>
+      <w:pPr>
+        <w:spacing w:line="360" w:lineRule="auto"/>
         <w:rPr>
           <w:rFonts w:ascii="Arial" w:hAnsi="Arial" w:cs="Arial"/>
           <w:b/>
           <w:bCs/>
           <w:color w:val="000000" w:themeColor="text1"/>
         </w:rPr>
-        <w:t xml:space="preserve"> </w:t>
-      </w:r>
+      </w:pPr>
       <w:r>
         <w:rPr>
           <w:rFonts w:ascii="Arial" w:hAnsi="Arial" w:cs="Arial"/>
@@ -15181,110 +15376,24 @@
           <w:bCs/>
           <w:color w:val="000000" w:themeColor="text1"/>
         </w:rPr>
-        <w:t xml:space="preserve"> </w:t>
-      </w:r>
-      <w:r>
-        <w:rPr>
-          <w:rFonts w:ascii="Arial" w:hAnsi="Arial" w:cs="Arial"/>
-          <w:color w:val="000000" w:themeColor="text1"/>
-        </w:rPr>
-        <w:t>The Austin Animal Center Intake</w:t>
-      </w:r>
-      <w:r>
-        <w:rPr>
-          <w:rFonts w:ascii="Arial" w:hAnsi="Arial" w:cs="Arial"/>
-          <w:color w:val="000000" w:themeColor="text1"/>
-        </w:rPr>
-        <w:t>s</w:t>
-      </w:r>
-      <w:r>
-        <w:rPr>
-          <w:rFonts w:ascii="Arial" w:hAnsi="Arial" w:cs="Arial"/>
-          <w:color w:val="000000" w:themeColor="text1"/>
-        </w:rPr>
-        <w:t xml:space="preserve"> and Outcomes datasets are owned and maintained </w:t>
-      </w:r>
-      <w:r>
-        <w:rPr>
-          <w:rFonts w:ascii="Arial" w:hAnsi="Arial" w:cs="Arial"/>
-          <w:color w:val="000000" w:themeColor="text1"/>
-        </w:rPr>
-        <w:t>by</w:t>
-      </w:r>
-      <w:r>
-        <w:rPr>
-          <w:rFonts w:ascii="Arial" w:hAnsi="Arial" w:cs="Arial"/>
-          <w:color w:val="000000" w:themeColor="text1"/>
-        </w:rPr>
-        <w:t xml:space="preserve"> the City of Austin and </w:t>
-      </w:r>
-      <w:r>
-        <w:rPr>
-          <w:rFonts w:ascii="Arial" w:hAnsi="Arial" w:cs="Arial"/>
-          <w:color w:val="000000" w:themeColor="text1"/>
-        </w:rPr>
-        <w:t>published through the City of Austin Open Data Portal under an open public license</w:t>
-      </w:r>
-      <w:r>
-        <w:rPr>
-          <w:rFonts w:ascii="Arial" w:hAnsi="Arial" w:cs="Arial"/>
-          <w:color w:val="000000" w:themeColor="text1"/>
-        </w:rPr>
-        <w:t xml:space="preserve">. The City of Austin ensures data accuracy and updates. This project used the data </w:t>
-      </w:r>
-      <w:r>
-        <w:rPr>
-          <w:rFonts w:ascii="Arial" w:hAnsi="Arial" w:cs="Arial"/>
-          <w:color w:val="000000" w:themeColor="text1"/>
-        </w:rPr>
-        <w:t xml:space="preserve">solely for academic research, in accordance with the open license terms, and the dataset was </w:t>
-      </w:r>
-      <w:r>
-        <w:rPr>
-          <w:rFonts w:ascii="Arial" w:hAnsi="Arial" w:cs="Arial"/>
-          <w:color w:val="000000" w:themeColor="text1"/>
-        </w:rPr>
-        <w:t xml:space="preserve">securely </w:t>
-      </w:r>
-      <w:r>
-        <w:rPr>
-          <w:rFonts w:ascii="Arial" w:hAnsi="Arial" w:cs="Arial"/>
-          <w:color w:val="000000" w:themeColor="text1"/>
-        </w:rPr>
-        <w:t xml:space="preserve">stored on </w:t>
-      </w:r>
-      <w:r>
-        <w:rPr>
-          <w:rFonts w:ascii="Arial" w:hAnsi="Arial" w:cs="Arial"/>
-          <w:color w:val="000000" w:themeColor="text1"/>
-        </w:rPr>
-        <w:t xml:space="preserve">the </w:t>
-      </w:r>
-      <w:r>
-        <w:rPr>
-          <w:rFonts w:ascii="Arial" w:hAnsi="Arial" w:cs="Arial"/>
-          <w:color w:val="000000" w:themeColor="text1"/>
-        </w:rPr>
-        <w:t>user’s laptop. No modifications were made to the source file</w:t>
-      </w:r>
-      <w:r>
-        <w:rPr>
-          <w:rFonts w:ascii="Arial" w:hAnsi="Arial" w:cs="Arial"/>
-          <w:color w:val="000000" w:themeColor="text1"/>
-        </w:rPr>
-        <w:t>s; all data cleaning was completed on copies and in a Python environment.</w:t>
-      </w:r>
-    </w:p>
-    <w:p>
-      <w:pPr>
-        <w:spacing w:line="360" w:lineRule="auto"/>
+        <w:t>Privacy</w:t>
+      </w:r>
+      <w:r>
         <w:rPr>
           <w:rFonts w:ascii="Arial" w:hAnsi="Arial" w:cs="Arial"/>
           <w:b/>
           <w:bCs/>
           <w:color w:val="000000" w:themeColor="text1"/>
         </w:rPr>
-      </w:pPr>
+        <w:t xml:space="preserve"> </w:t>
+      </w:r>
+      <w:r>
+        <w:rPr>
+          <w:rFonts w:ascii="Arial" w:hAnsi="Arial" w:cs="Arial"/>
+          <w:color w:val="000000" w:themeColor="text1"/>
+        </w:rPr>
+        <w:t>--</w:t>
+      </w:r>
       <w:r>
         <w:rPr>
           <w:rFonts w:ascii="Arial" w:hAnsi="Arial" w:cs="Arial"/>
@@ -15292,8 +15401,77 @@
           <w:bCs/>
           <w:color w:val="000000" w:themeColor="text1"/>
         </w:rPr>
-        <w:lastRenderedPageBreak/>
-        <w:t>Privacy</w:t>
+        <w:t xml:space="preserve"> </w:t>
+      </w:r>
+      <w:r>
+        <w:rPr>
+          <w:rFonts w:ascii="Arial" w:hAnsi="Arial" w:cs="Arial"/>
+          <w:color w:val="000000" w:themeColor="text1"/>
+        </w:rPr>
+        <w:t xml:space="preserve">These datasets contain no </w:t>
+      </w:r>
+      <w:r>
+        <w:rPr>
+          <w:rFonts w:ascii="Arial" w:hAnsi="Arial" w:cs="Arial"/>
+          <w:color w:val="000000" w:themeColor="text1"/>
+        </w:rPr>
+        <w:t>personally</w:t>
+      </w:r>
+      <w:r>
+        <w:rPr>
+          <w:rFonts w:ascii="Arial" w:hAnsi="Arial" w:cs="Arial"/>
+          <w:color w:val="000000" w:themeColor="text1"/>
+        </w:rPr>
+        <w:t xml:space="preserve"> identifiable </w:t>
+      </w:r>
+      <w:r>
+        <w:rPr>
+          <w:rFonts w:ascii="Arial" w:hAnsi="Arial" w:cs="Arial"/>
+          <w:color w:val="000000" w:themeColor="text1"/>
+        </w:rPr>
+        <w:t>information about human</w:t>
+      </w:r>
+      <w:r>
+        <w:rPr>
+          <w:rFonts w:ascii="Arial" w:hAnsi="Arial" w:cs="Arial"/>
+          <w:color w:val="000000" w:themeColor="text1"/>
+        </w:rPr>
+        <w:t xml:space="preserve"> identities</w:t>
+      </w:r>
+      <w:r>
+        <w:rPr>
+          <w:rFonts w:ascii="Arial" w:hAnsi="Arial" w:cs="Arial"/>
+          <w:color w:val="000000" w:themeColor="text1"/>
+        </w:rPr>
+        <w:t>.</w:t>
+      </w:r>
+      <w:r>
+        <w:rPr>
+          <w:rFonts w:ascii="Arial" w:hAnsi="Arial" w:cs="Arial"/>
+          <w:color w:val="000000" w:themeColor="text1"/>
+        </w:rPr>
+        <w:t xml:space="preserve"> Animal names do not constitute </w:t>
+      </w:r>
+      <w:r>
+        <w:rPr>
+          <w:rFonts w:ascii="Arial" w:hAnsi="Arial" w:cs="Arial"/>
+          <w:color w:val="000000" w:themeColor="text1"/>
+        </w:rPr>
+        <w:t>PII but</w:t>
+      </w:r>
+      <w:r>
+        <w:rPr>
+          <w:rFonts w:ascii="Arial" w:hAnsi="Arial" w:cs="Arial"/>
+          <w:color w:val="000000" w:themeColor="text1"/>
+        </w:rPr>
+        <w:t xml:space="preserve"> were dropped from the project as unnecessary</w:t>
+      </w:r>
+      <w:r>
+        <w:rPr>
+          <w:rFonts w:ascii="Arial" w:hAnsi="Arial" w:cs="Arial"/>
+          <w:color w:val="000000" w:themeColor="text1"/>
+        </w:rPr>
+        <w:t xml:space="preserve"> for modeling</w:t>
       </w:r>
       <w:r>
         <w:rPr>
@@ -15302,105 +15480,44 @@
           <w:bCs/>
           <w:color w:val="000000" w:themeColor="text1"/>
         </w:rPr>
-        <w:t xml:space="preserve"> </w:t>
-      </w:r>
-      <w:r>
-        <w:rPr>
-          <w:rFonts w:ascii="Arial" w:hAnsi="Arial" w:cs="Arial"/>
-          <w:color w:val="000000" w:themeColor="text1"/>
-        </w:rPr>
-        <w:t>--</w:t>
-      </w:r>
-      <w:r>
+        <w:t>.</w:t>
+      </w:r>
+    </w:p>
+    <w:p>
+      <w:pPr>
+        <w:spacing w:line="360" w:lineRule="auto"/>
         <w:rPr>
           <w:rFonts w:ascii="Arial" w:hAnsi="Arial" w:cs="Arial"/>
           <w:b/>
           <w:bCs/>
           <w:color w:val="000000" w:themeColor="text1"/>
         </w:rPr>
-        <w:t xml:space="preserve"> </w:t>
-      </w:r>
-      <w:r>
-        <w:rPr>
-          <w:rFonts w:ascii="Arial" w:hAnsi="Arial" w:cs="Arial"/>
-          <w:color w:val="000000" w:themeColor="text1"/>
-        </w:rPr>
-        <w:t xml:space="preserve">These datasets contain no </w:t>
-      </w:r>
-      <w:r>
-        <w:rPr>
-          <w:rFonts w:ascii="Arial" w:hAnsi="Arial" w:cs="Arial"/>
-          <w:color w:val="000000" w:themeColor="text1"/>
-        </w:rPr>
-        <w:t>personally</w:t>
-      </w:r>
-      <w:r>
-        <w:rPr>
-          <w:rFonts w:ascii="Arial" w:hAnsi="Arial" w:cs="Arial"/>
-          <w:color w:val="000000" w:themeColor="text1"/>
-        </w:rPr>
-        <w:t xml:space="preserve"> identifiable </w:t>
-      </w:r>
-      <w:r>
-        <w:rPr>
-          <w:rFonts w:ascii="Arial" w:hAnsi="Arial" w:cs="Arial"/>
-          <w:color w:val="000000" w:themeColor="text1"/>
-        </w:rPr>
-        <w:t>information about human</w:t>
-      </w:r>
-      <w:r>
-        <w:rPr>
-          <w:rFonts w:ascii="Arial" w:hAnsi="Arial" w:cs="Arial"/>
-          <w:color w:val="000000" w:themeColor="text1"/>
-        </w:rPr>
-        <w:t xml:space="preserve"> identities</w:t>
-      </w:r>
-      <w:r>
-        <w:rPr>
-          <w:rFonts w:ascii="Arial" w:hAnsi="Arial" w:cs="Arial"/>
-          <w:color w:val="000000" w:themeColor="text1"/>
-        </w:rPr>
-        <w:t>.</w:t>
-      </w:r>
-      <w:r>
-        <w:rPr>
-          <w:rFonts w:ascii="Arial" w:hAnsi="Arial" w:cs="Arial"/>
-          <w:color w:val="000000" w:themeColor="text1"/>
-        </w:rPr>
-        <w:t xml:space="preserve"> Animal names do not constitute </w:t>
-      </w:r>
-      <w:r>
-        <w:rPr>
-          <w:rFonts w:ascii="Arial" w:hAnsi="Arial" w:cs="Arial"/>
-          <w:color w:val="000000" w:themeColor="text1"/>
-        </w:rPr>
-        <w:t>PII but</w:t>
-      </w:r>
-      <w:r>
-        <w:rPr>
-          <w:rFonts w:ascii="Arial" w:hAnsi="Arial" w:cs="Arial"/>
-          <w:color w:val="000000" w:themeColor="text1"/>
-        </w:rPr>
-        <w:t xml:space="preserve"> were dropped from the project as unnecessary</w:t>
-      </w:r>
-      <w:r>
-        <w:rPr>
-          <w:rFonts w:ascii="Arial" w:hAnsi="Arial" w:cs="Arial"/>
-          <w:color w:val="000000" w:themeColor="text1"/>
-        </w:rPr>
-        <w:t xml:space="preserve"> for modeling.</w:t>
-      </w:r>
+      </w:pPr>
     </w:p>
     <w:p>
       <w:pPr>
         <w:spacing w:line="360" w:lineRule="auto"/>
+        <w:rPr>
+          <w:rFonts w:ascii="Arial" w:hAnsi="Arial" w:cs="Arial"/>
+          <w:color w:val="000000" w:themeColor="text1"/>
+        </w:rPr>
+      </w:pPr>
+      <w:r>
         <w:rPr>
           <w:rFonts w:ascii="Arial" w:hAnsi="Arial" w:cs="Arial"/>
           <w:b/>
           <w:bCs/>
           <w:color w:val="000000" w:themeColor="text1"/>
         </w:rPr>
-      </w:pPr>
+        <w:t>Security</w:t>
+      </w:r>
+      <w:r>
+        <w:rPr>
+          <w:rFonts w:ascii="Arial" w:hAnsi="Arial" w:cs="Arial"/>
+          <w:color w:val="000000" w:themeColor="text1"/>
+        </w:rPr>
+        <w:t xml:space="preserve"> --</w:t>
+      </w:r>
       <w:r>
         <w:rPr>
           <w:rFonts w:ascii="Arial" w:hAnsi="Arial" w:cs="Arial"/>
@@ -15408,59 +15525,54 @@
           <w:bCs/>
           <w:color w:val="000000" w:themeColor="text1"/>
         </w:rPr>
-        <w:t>Security</w:t>
-      </w:r>
-      <w:r>
-        <w:rPr>
-          <w:rFonts w:ascii="Arial" w:hAnsi="Arial" w:cs="Arial"/>
-          <w:color w:val="000000" w:themeColor="text1"/>
-        </w:rPr>
-        <w:t xml:space="preserve"> --</w:t>
-      </w:r>
-      <w:r>
+        <w:t xml:space="preserve"> </w:t>
+      </w:r>
+      <w:r>
+        <w:rPr>
+          <w:rFonts w:ascii="Arial" w:hAnsi="Arial" w:cs="Arial"/>
+          <w:color w:val="000000" w:themeColor="text1"/>
+        </w:rPr>
+        <w:t xml:space="preserve">Datasets were downloaded over secure connections from the City of Austin Open Data Portal </w:t>
+      </w:r>
+      <w:r>
+        <w:rPr>
+          <w:rFonts w:ascii="Arial" w:hAnsi="Arial" w:cs="Arial"/>
+          <w:color w:val="000000" w:themeColor="text1"/>
+        </w:rPr>
+        <w:t xml:space="preserve">and stored on the user’s </w:t>
+      </w:r>
+      <w:r>
+        <w:rPr>
+          <w:rFonts w:ascii="Arial" w:hAnsi="Arial" w:cs="Arial"/>
+          <w:color w:val="000000" w:themeColor="text1"/>
+        </w:rPr>
+        <w:t>password-protected</w:t>
+      </w:r>
+      <w:r>
+        <w:rPr>
+          <w:rFonts w:ascii="Arial" w:hAnsi="Arial" w:cs="Arial"/>
+          <w:color w:val="000000" w:themeColor="text1"/>
+        </w:rPr>
+        <w:t xml:space="preserve"> laptop and </w:t>
+      </w:r>
+      <w:r>
+        <w:rPr>
+          <w:rFonts w:ascii="Arial" w:hAnsi="Arial" w:cs="Arial"/>
+          <w:color w:val="000000" w:themeColor="text1"/>
+        </w:rPr>
+        <w:t>OneDrive.</w:t>
+      </w:r>
+    </w:p>
+    <w:p>
+      <w:pPr>
+        <w:spacing w:line="360" w:lineRule="auto"/>
         <w:rPr>
           <w:rFonts w:ascii="Arial" w:hAnsi="Arial" w:cs="Arial"/>
           <w:b/>
           <w:bCs/>
           <w:color w:val="000000" w:themeColor="text1"/>
         </w:rPr>
-        <w:t xml:space="preserve"> </w:t>
-      </w:r>
-      <w:r>
-        <w:rPr>
-          <w:rFonts w:ascii="Arial" w:hAnsi="Arial" w:cs="Arial"/>
-          <w:color w:val="000000" w:themeColor="text1"/>
-        </w:rPr>
-        <w:t xml:space="preserve">Datasets were downloaded over secure connections from the City of Austin Open Data Portal </w:t>
-      </w:r>
-      <w:r>
-        <w:rPr>
-          <w:rFonts w:ascii="Arial" w:hAnsi="Arial" w:cs="Arial"/>
-          <w:color w:val="000000" w:themeColor="text1"/>
-        </w:rPr>
-        <w:t xml:space="preserve">and stored on the user’s </w:t>
-      </w:r>
-      <w:r>
-        <w:rPr>
-          <w:rFonts w:ascii="Arial" w:hAnsi="Arial" w:cs="Arial"/>
-          <w:color w:val="000000" w:themeColor="text1"/>
-        </w:rPr>
-        <w:t>password-protected</w:t>
-      </w:r>
-      <w:r>
-        <w:rPr>
-          <w:rFonts w:ascii="Arial" w:hAnsi="Arial" w:cs="Arial"/>
-          <w:color w:val="000000" w:themeColor="text1"/>
-        </w:rPr>
-        <w:t xml:space="preserve"> laptop and </w:t>
-      </w:r>
-      <w:r>
-        <w:rPr>
-          <w:rFonts w:ascii="Arial" w:hAnsi="Arial" w:cs="Arial"/>
-          <w:color w:val="000000" w:themeColor="text1"/>
-        </w:rPr>
-        <w:t>OneDrive.</w:t>
-      </w:r>
+      </w:pPr>
     </w:p>
     <w:p>
       <w:pPr>
@@ -15550,7 +15662,19 @@
         <w:rPr>
           <w:rFonts w:ascii="Arial" w:hAnsi="Arial" w:cs="Arial"/>
         </w:rPr>
-        <w:t>Findings presented transparently with APA 7</w:t>
+        <w:t xml:space="preserve">Findings </w:t>
+      </w:r>
+      <w:r>
+        <w:rPr>
+          <w:rFonts w:ascii="Arial" w:hAnsi="Arial" w:cs="Arial"/>
+        </w:rPr>
+        <w:t>are presented</w:t>
+      </w:r>
+      <w:r>
+        <w:rPr>
+          <w:rFonts w:ascii="Arial" w:hAnsi="Arial" w:cs="Arial"/>
+        </w:rPr>
+        <w:t xml:space="preserve"> transparently with APA 7</w:t>
       </w:r>
       <w:r>
         <w:rPr>
@@ -20899,7 +21023,7 @@
     <w:charset w:val="00"/>
     <w:family w:val="swiss"/>
     <w:pitch w:val="variable"/>
-    <w:sig w:usb0="E4002EFF" w:usb1="C200247B" w:usb2="00000009" w:usb3="00000000" w:csb0="000001FF" w:csb1="00000000"/>
+    <w:sig w:usb0="E5002EFF" w:usb1="C200ACFF" w:usb2="00000009" w:usb3="00000000" w:csb0="000001FF" w:csb1="00000000"/>
   </w:font>
   <w:font w:name="Georgia">
     <w:panose1 w:val="02040502050405020303"/>
@@ -20916,7 +21040,6 @@
     <w:sig w:usb0="E0002EFF" w:usb1="C000785B" w:usb2="00000009" w:usb3="00000000" w:csb0="000001FF" w:csb1="00000000"/>
   </w:font>
   <w:font w:name="MS Mincho">
-    <w:altName w:val="ＭＳ 明朝"/>
     <w:panose1 w:val="02020609040205080304"/>
     <w:charset w:val="80"/>
     <w:family w:val="modern"/>
@@ -20955,6 +21078,7 @@
   <w:rsids>
     <w:rsidRoot w:val="0030784B"/>
     <w:rsid w:val="0030784B"/>
+    <w:rsid w:val="003D419B"/>
     <w:rsid w:val="006554D9"/>
     <w:rsid w:val="008F7FD3"/>
     <w:rsid w:val="009A5F76"/>
@@ -20962,6 +21086,7 @@
     <w:rsid w:val="00AB0A27"/>
     <w:rsid w:val="00BD123F"/>
     <w:rsid w:val="00C43120"/>
+    <w:rsid w:val="00F73E6E"/>
   </w:rsids>
   <m:mathPr>
     <m:mathFont m:val="Cambria Math"/>
@@ -21709,12 +21834,6 @@
 </file>
 
 <file path=customXml/item1.xml><?xml version="1.0" encoding="utf-8"?>
-<go:gDocsCustomXmlDataStorage xmlns:go="http://customooxmlschemas.google.com/" xmlns:r="http://schemas.openxmlformats.org/officeDocument/2006/relationships">
-  <go:docsCustomData xmlns:go="http://customooxmlschemas.google.com/" roundtripDataSignature="AMtx7mi9hMm1w2n+Vt6hN/m6X//z+ToJ7Q==">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</go:docsCustomData>
-</go:gDocsCustomXmlDataStorage>
-</file>
-
-<file path=customXml/item2.xml><?xml version="1.0" encoding="utf-8"?>
 <?mso-contentType ?>
 <FormTemplates xmlns="http://schemas.microsoft.com/sharepoint/v3/contenttype/forms">
   <Display>DocumentLibraryForm</Display>
@@ -21723,7 +21842,157 @@
 </FormTemplates>
 </file>
 
+<file path=customXml/item2.xml><?xml version="1.0" encoding="utf-8"?>
+<go:gDocsCustomXmlDataStorage xmlns:go="http://customooxmlschemas.google.com/" xmlns:r="http://schemas.openxmlformats.org/officeDocument/2006/relationships">
+  <go:docsCustomData xmlns:go="http://customooxmlschemas.google.com/" roundtripDataSignature="AMtx7mi9hMm1w2n+Vt6hN/m6X//z+ToJ7Q==">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</go:docsCustomData>
+</go:gDocsCustomXmlDataStorage>
+</file>
+
 <file path=customXml/item3.xml><?xml version="1.0" encoding="utf-8"?>
+<ct:contentTypeSchema xmlns:ct="http://schemas.microsoft.com/office/2006/metadata/contentType" xmlns:ma="http://schemas.microsoft.com/office/2006/metadata/properties/metaAttributes" ct:_="" ma:_="" ma:contentTypeName="Document" ma:contentTypeID="0x010100BD6C6811FDA4354DADCD440B75A43D37" ma:contentTypeVersion="3" ma:contentTypeDescription="Create a new document." ma:contentTypeScope="" ma:versionID="c37f1311c2859ad141e22abf422a569b">
+  <xsd:schema xmlns:xsd="http://www.w3.org/2001/XMLSchema" xmlns:xs="http://www.w3.org/2001/XMLSchema" xmlns:p="http://schemas.microsoft.com/office/2006/metadata/properties" xmlns:ns2="c340dd69-6dcb-4f68-be59-83f5ced86ed4" targetNamespace="http://schemas.microsoft.com/office/2006/metadata/properties" ma:root="true" ma:fieldsID="23e29cfcd205adb239cf41a2b6866d76" ns2:_="">
+    <xsd:import namespace="c340dd69-6dcb-4f68-be59-83f5ced86ed4"/>
+    <xsd:element name="properties">
+      <xsd:complexType>
+        <xsd:sequence>
+          <xsd:element name="documentManagement">
+            <xsd:complexType>
+              <xsd:all>
+                <xsd:element ref="ns2:MediaServiceMetadata" minOccurs="0"/>
+                <xsd:element ref="ns2:MediaServiceFastMetadata" minOccurs="0"/>
+                <xsd:element ref="ns2:MediaServiceSearchProperties" minOccurs="0"/>
+              </xsd:all>
+            </xsd:complexType>
+          </xsd:element>
+        </xsd:sequence>
+      </xsd:complexType>
+    </xsd:element>
+  </xsd:schema>
+  <xsd:schema xmlns:xsd="http://www.w3.org/2001/XMLSchema" xmlns:xs="http://www.w3.org/2001/XMLSchema" xmlns:dms="http://schemas.microsoft.com/office/2006/documentManagement/types" xmlns:pc="http://schemas.microsoft.com/office/infopath/2007/PartnerControls" targetNamespace="c340dd69-6dcb-4f68-be59-83f5ced86ed4" elementFormDefault="qualified">
+    <xsd:import namespace="http://schemas.microsoft.com/office/2006/documentManagement/types"/>
+    <xsd:import namespace="http://schemas.microsoft.com/office/infopath/2007/PartnerControls"/>
+    <xsd:element name="MediaServiceMetadata" ma:index="8" nillable="true" ma:displayName="MediaServiceMetadata" ma:hidden="true" ma:internalName="MediaServiceMetadata" ma:readOnly="true">
+      <xsd:simpleType>
+        <xsd:restriction base="dms:Note"/>
+      </xsd:simpleType>
+    </xsd:element>
+    <xsd:element name="MediaServiceFastMetadata" ma:index="9" nillable="true" ma:displayName="MediaServiceFastMetadata" ma:hidden="true" ma:internalName="MediaServiceFastMetadata" ma:readOnly="true">
+      <xsd:simpleType>
+        <xsd:restriction base="dms:Note"/>
+      </xsd:simpleType>
+    </xsd:element>
+    <xsd:element name="MediaServiceSearchProperties" ma:index="10" nillable="true" ma:displayName="MediaServiceSearchProperties" ma:hidden="true" ma:internalName="MediaServiceSearchProperties" ma:readOnly="true">
+      <xsd:simpleType>
+        <xsd:restriction base="dms:Note"/>
+      </xsd:simpleType>
+    </xsd:element>
+  </xsd:schema>
+  <xsd:schema xmlns="http://schemas.openxmlformats.org/package/2006/metadata/core-properties" xmlns:xsd="http://www.w3.org/2001/XMLSchema" xmlns:xsi="http://www.w3.org/2001/XMLSchema-instance" xmlns:dc="http://purl.org/dc/elements/1.1/" xmlns:dcterms="http://purl.org/dc/terms/" xmlns:odoc="http://schemas.microsoft.com/internal/obd" targetNamespace="http://schemas.openxmlformats.org/package/2006/metadata/core-properties" elementFormDefault="qualified" attributeFormDefault="unqualified" blockDefault="#all">
+    <xsd:import namespace="http://purl.org/dc/elements/1.1/" schemaLocation="http://dublincore.org/schemas/xmls/qdc/2003/04/02/dc.xsd"/>
+    <xsd:import namespace="http://purl.org/dc/terms/" schemaLocation="http://dublincore.org/schemas/xmls/qdc/2003/04/02/dcterms.xsd"/>
+    <xsd:element name="coreProperties" type="CT_coreProperties"/>
+    <xsd:complexType name="CT_coreProperties">
+      <xsd:all>
+        <xsd:element ref="dc:creator" minOccurs="0" maxOccurs="1"/>
+        <xsd:element ref="dcterms:created" minOccurs="0" maxOccurs="1"/>
+        <xsd:element ref="dc:identifier" minOccurs="0" maxOccurs="1"/>
+        <xsd:element name="contentType" minOccurs="0" maxOccurs="1" type="xsd:string" ma:index="0" ma:displayName="Content Type"/>
+        <xsd:element ref="dc:title" minOccurs="0" maxOccurs="1" ma:index="4" ma:displayName="Title"/>
+        <xsd:element ref="dc:subject" minOccurs="0" maxOccurs="1"/>
+        <xsd:element ref="dc:description" minOccurs="0" maxOccurs="1"/>
+        <xsd:element name="keywords" minOccurs="0" maxOccurs="1" type="xsd:string"/>
+        <xsd:element ref="dc:language" minOccurs="0" maxOccurs="1"/>
+        <xsd:element name="category" minOccurs="0" maxOccurs="1" type="xsd:string"/>
+        <xsd:element name="version" minOccurs="0" maxOccurs="1" type="xsd:string"/>
+        <xsd:element name="revision" minOccurs="0" maxOccurs="1" type="xsd:string">
+          <xsd:annotation>
+            <xsd:documentation>
+                        This value indicates the number of saves or revisions. The application is responsible for updating this value after each revision.
+                    </xsd:documentation>
+          </xsd:annotation>
+        </xsd:element>
+        <xsd:element name="lastModifiedBy" minOccurs="0" maxOccurs="1" type="xsd:string"/>
+        <xsd:element ref="dcterms:modified" minOccurs="0" maxOccurs="1"/>
+        <xsd:element name="contentStatus" minOccurs="0" maxOccurs="1" type="xsd:string"/>
+      </xsd:all>
+    </xsd:complexType>
+  </xsd:schema>
+  <xs:schema xmlns:pc="http://schemas.microsoft.com/office/infopath/2007/PartnerControls" xmlns:xs="http://www.w3.org/2001/XMLSchema" targetNamespace="http://schemas.microsoft.com/office/infopath/2007/PartnerControls" elementFormDefault="qualified" attributeFormDefault="unqualified">
+    <xs:element name="Person">
+      <xs:complexType>
+        <xs:sequence>
+          <xs:element ref="pc:DisplayName" minOccurs="0"/>
+          <xs:element ref="pc:AccountId" minOccurs="0"/>
+          <xs:element ref="pc:AccountType" minOccurs="0"/>
+        </xs:sequence>
+      </xs:complexType>
+    </xs:element>
+    <xs:element name="DisplayName" type="xs:string"/>
+    <xs:element name="AccountId" type="xs:string"/>
+    <xs:element name="AccountType" type="xs:string"/>
+    <xs:element name="BDCAssociatedEntity">
+      <xs:complexType>
+        <xs:sequence>
+          <xs:element ref="pc:BDCEntity" minOccurs="0" maxOccurs="unbounded"/>
+        </xs:sequence>
+        <xs:attribute ref="pc:EntityNamespace"/>
+        <xs:attribute ref="pc:EntityName"/>
+        <xs:attribute ref="pc:SystemInstanceName"/>
+        <xs:attribute ref="pc:AssociationName"/>
+      </xs:complexType>
+    </xs:element>
+    <xs:attribute name="EntityNamespace" type="xs:string"/>
+    <xs:attribute name="EntityName" type="xs:string"/>
+    <xs:attribute name="SystemInstanceName" type="xs:string"/>
+    <xs:attribute name="AssociationName" type="xs:string"/>
+    <xs:element name="BDCEntity">
+      <xs:complexType>
+        <xs:sequence>
+          <xs:element ref="pc:EntityDisplayName" minOccurs="0"/>
+          <xs:element ref="pc:EntityInstanceReference" minOccurs="0"/>
+          <xs:element ref="pc:EntityId1" minOccurs="0"/>
+          <xs:element ref="pc:EntityId2" minOccurs="0"/>
+          <xs:element ref="pc:EntityId3" minOccurs="0"/>
+          <xs:element ref="pc:EntityId4" minOccurs="0"/>
+          <xs:element ref="pc:EntityId5" minOccurs="0"/>
+        </xs:sequence>
+      </xs:complexType>
+    </xs:element>
+    <xs:element name="EntityDisplayName" type="xs:string"/>
+    <xs:element name="EntityInstanceReference" type="xs:string"/>
+    <xs:element name="EntityId1" type="xs:string"/>
+    <xs:element name="EntityId2" type="xs:string"/>
+    <xs:element name="EntityId3" type="xs:string"/>
+    <xs:element name="EntityId4" type="xs:string"/>
+    <xs:element name="EntityId5" type="xs:string"/>
+    <xs:element name="Terms">
+      <xs:complexType>
+        <xs:sequence>
+          <xs:element ref="pc:TermInfo" minOccurs="0" maxOccurs="unbounded"/>
+        </xs:sequence>
+      </xs:complexType>
+    </xs:element>
+    <xs:element name="TermInfo">
+      <xs:complexType>
+        <xs:sequence>
+          <xs:element ref="pc:TermName" minOccurs="0"/>
+          <xs:element ref="pc:TermId" minOccurs="0"/>
+        </xs:sequence>
+      </xs:complexType>
+    </xs:element>
+    <xs:element name="TermName" type="xs:string"/>
+    <xs:element name="TermId" type="xs:string"/>
+  </xs:schema>
+</ct:contentTypeSchema>
+</file>
+
+<file path=customXml/item4.xml><?xml version="1.0" encoding="utf-8"?>
+<p:properties xmlns:p="http://schemas.microsoft.com/office/2006/metadata/properties" xmlns:xsi="http://www.w3.org/2001/XMLSchema-instance" xmlns:pc="http://schemas.microsoft.com/office/infopath/2007/PartnerControls">
+  <documentManagement/>
+</p:properties>
+</file>
+
+<file path=customXml/item5.xml><?xml version="1.0" encoding="utf-8"?>
 <b:Sources xmlns:b="http://schemas.openxmlformats.org/officeDocument/2006/bibliography" xmlns="http://schemas.openxmlformats.org/officeDocument/2006/bibliography" SelectedStyle="\APASeventhEdition.xsl" StyleName="APA7" Version="7">
   <b:Source>
     <b:Tag>Pow21</b:Tag>
@@ -22071,151 +22340,15 @@
 </b:Sources>
 </file>
 
-<file path=customXml/item4.xml><?xml version="1.0" encoding="utf-8"?>
-<p:properties xmlns:p="http://schemas.microsoft.com/office/2006/metadata/properties" xmlns:xsi="http://www.w3.org/2001/XMLSchema-instance" xmlns:pc="http://schemas.microsoft.com/office/infopath/2007/PartnerControls">
-  <documentManagement/>
-</p:properties>
+<file path=customXml/itemProps1.xml><?xml version="1.0" encoding="utf-8"?>
+<ds:datastoreItem xmlns:ds="http://schemas.openxmlformats.org/officeDocument/2006/customXml" ds:itemID="{038ECA9E-3AC2-4841-9944-C2555DB6A71C}">
+  <ds:schemaRefs>
+    <ds:schemaRef ds:uri="http://schemas.microsoft.com/sharepoint/v3/contenttype/forms"/>
+  </ds:schemaRefs>
+</ds:datastoreItem>
 </file>
 
-<file path=customXml/item5.xml><?xml version="1.0" encoding="utf-8"?>
-<ct:contentTypeSchema xmlns:ct="http://schemas.microsoft.com/office/2006/metadata/contentType" xmlns:ma="http://schemas.microsoft.com/office/2006/metadata/properties/metaAttributes" ct:_="" ma:_="" ma:contentTypeName="Document" ma:contentTypeID="0x010100BD6C6811FDA4354DADCD440B75A43D37" ma:contentTypeVersion="3" ma:contentTypeDescription="Create a new document." ma:contentTypeScope="" ma:versionID="c37f1311c2859ad141e22abf422a569b">
-  <xsd:schema xmlns:xsd="http://www.w3.org/2001/XMLSchema" xmlns:xs="http://www.w3.org/2001/XMLSchema" xmlns:p="http://schemas.microsoft.com/office/2006/metadata/properties" xmlns:ns2="c340dd69-6dcb-4f68-be59-83f5ced86ed4" targetNamespace="http://schemas.microsoft.com/office/2006/metadata/properties" ma:root="true" ma:fieldsID="23e29cfcd205adb239cf41a2b6866d76" ns2:_="">
-    <xsd:import namespace="c340dd69-6dcb-4f68-be59-83f5ced86ed4"/>
-    <xsd:element name="properties">
-      <xsd:complexType>
-        <xsd:sequence>
-          <xsd:element name="documentManagement">
-            <xsd:complexType>
-              <xsd:all>
-                <xsd:element ref="ns2:MediaServiceMetadata" minOccurs="0"/>
-                <xsd:element ref="ns2:MediaServiceFastMetadata" minOccurs="0"/>
-                <xsd:element ref="ns2:MediaServiceSearchProperties" minOccurs="0"/>
-              </xsd:all>
-            </xsd:complexType>
-          </xsd:element>
-        </xsd:sequence>
-      </xsd:complexType>
-    </xsd:element>
-  </xsd:schema>
-  <xsd:schema xmlns:xsd="http://www.w3.org/2001/XMLSchema" xmlns:xs="http://www.w3.org/2001/XMLSchema" xmlns:dms="http://schemas.microsoft.com/office/2006/documentManagement/types" xmlns:pc="http://schemas.microsoft.com/office/infopath/2007/PartnerControls" targetNamespace="c340dd69-6dcb-4f68-be59-83f5ced86ed4" elementFormDefault="qualified">
-    <xsd:import namespace="http://schemas.microsoft.com/office/2006/documentManagement/types"/>
-    <xsd:import namespace="http://schemas.microsoft.com/office/infopath/2007/PartnerControls"/>
-    <xsd:element name="MediaServiceMetadata" ma:index="8" nillable="true" ma:displayName="MediaServiceMetadata" ma:hidden="true" ma:internalName="MediaServiceMetadata" ma:readOnly="true">
-      <xsd:simpleType>
-        <xsd:restriction base="dms:Note"/>
-      </xsd:simpleType>
-    </xsd:element>
-    <xsd:element name="MediaServiceFastMetadata" ma:index="9" nillable="true" ma:displayName="MediaServiceFastMetadata" ma:hidden="true" ma:internalName="MediaServiceFastMetadata" ma:readOnly="true">
-      <xsd:simpleType>
-        <xsd:restriction base="dms:Note"/>
-      </xsd:simpleType>
-    </xsd:element>
-    <xsd:element name="MediaServiceSearchProperties" ma:index="10" nillable="true" ma:displayName="MediaServiceSearchProperties" ma:hidden="true" ma:internalName="MediaServiceSearchProperties" ma:readOnly="true">
-      <xsd:simpleType>
-        <xsd:restriction base="dms:Note"/>
-      </xsd:simpleType>
-    </xsd:element>
-  </xsd:schema>
-  <xsd:schema xmlns="http://schemas.openxmlformats.org/package/2006/metadata/core-properties" xmlns:xsd="http://www.w3.org/2001/XMLSchema" xmlns:xsi="http://www.w3.org/2001/XMLSchema-instance" xmlns:dc="http://purl.org/dc/elements/1.1/" xmlns:dcterms="http://purl.org/dc/terms/" xmlns:odoc="http://schemas.microsoft.com/internal/obd" targetNamespace="http://schemas.openxmlformats.org/package/2006/metadata/core-properties" elementFormDefault="qualified" attributeFormDefault="unqualified" blockDefault="#all">
-    <xsd:import namespace="http://purl.org/dc/elements/1.1/" schemaLocation="http://dublincore.org/schemas/xmls/qdc/2003/04/02/dc.xsd"/>
-    <xsd:import namespace="http://purl.org/dc/terms/" schemaLocation="http://dublincore.org/schemas/xmls/qdc/2003/04/02/dcterms.xsd"/>
-    <xsd:element name="coreProperties" type="CT_coreProperties"/>
-    <xsd:complexType name="CT_coreProperties">
-      <xsd:all>
-        <xsd:element ref="dc:creator" minOccurs="0" maxOccurs="1"/>
-        <xsd:element ref="dcterms:created" minOccurs="0" maxOccurs="1"/>
-        <xsd:element ref="dc:identifier" minOccurs="0" maxOccurs="1"/>
-        <xsd:element name="contentType" minOccurs="0" maxOccurs="1" type="xsd:string" ma:index="0" ma:displayName="Content Type"/>
-        <xsd:element ref="dc:title" minOccurs="0" maxOccurs="1" ma:index="4" ma:displayName="Title"/>
-        <xsd:element ref="dc:subject" minOccurs="0" maxOccurs="1"/>
-        <xsd:element ref="dc:description" minOccurs="0" maxOccurs="1"/>
-        <xsd:element name="keywords" minOccurs="0" maxOccurs="1" type="xsd:string"/>
-        <xsd:element ref="dc:language" minOccurs="0" maxOccurs="1"/>
-        <xsd:element name="category" minOccurs="0" maxOccurs="1" type="xsd:string"/>
-        <xsd:element name="version" minOccurs="0" maxOccurs="1" type="xsd:string"/>
-        <xsd:element name="revision" minOccurs="0" maxOccurs="1" type="xsd:string">
-          <xsd:annotation>
-            <xsd:documentation>
-                        This value indicates the number of saves or revisions. The application is responsible for updating this value after each revision.
-                    </xsd:documentation>
-          </xsd:annotation>
-        </xsd:element>
-        <xsd:element name="lastModifiedBy" minOccurs="0" maxOccurs="1" type="xsd:string"/>
-        <xsd:element ref="dcterms:modified" minOccurs="0" maxOccurs="1"/>
-        <xsd:element name="contentStatus" minOccurs="0" maxOccurs="1" type="xsd:string"/>
-      </xsd:all>
-    </xsd:complexType>
-  </xsd:schema>
-  <xs:schema xmlns:pc="http://schemas.microsoft.com/office/infopath/2007/PartnerControls" xmlns:xs="http://www.w3.org/2001/XMLSchema" targetNamespace="http://schemas.microsoft.com/office/infopath/2007/PartnerControls" elementFormDefault="qualified" attributeFormDefault="unqualified">
-    <xs:element name="Person">
-      <xs:complexType>
-        <xs:sequence>
-          <xs:element ref="pc:DisplayName" minOccurs="0"/>
-          <xs:element ref="pc:AccountId" minOccurs="0"/>
-          <xs:element ref="pc:AccountType" minOccurs="0"/>
-        </xs:sequence>
-      </xs:complexType>
-    </xs:element>
-    <xs:element name="DisplayName" type="xs:string"/>
-    <xs:element name="AccountId" type="xs:string"/>
-    <xs:element name="AccountType" type="xs:string"/>
-    <xs:element name="BDCAssociatedEntity">
-      <xs:complexType>
-        <xs:sequence>
-          <xs:element ref="pc:BDCEntity" minOccurs="0" maxOccurs="unbounded"/>
-        </xs:sequence>
-        <xs:attribute ref="pc:EntityNamespace"/>
-        <xs:attribute ref="pc:EntityName"/>
-        <xs:attribute ref="pc:SystemInstanceName"/>
-        <xs:attribute ref="pc:AssociationName"/>
-      </xs:complexType>
-    </xs:element>
-    <xs:attribute name="EntityNamespace" type="xs:string"/>
-    <xs:attribute name="EntityName" type="xs:string"/>
-    <xs:attribute name="SystemInstanceName" type="xs:string"/>
-    <xs:attribute name="AssociationName" type="xs:string"/>
-    <xs:element name="BDCEntity">
-      <xs:complexType>
-        <xs:sequence>
-          <xs:element ref="pc:EntityDisplayName" minOccurs="0"/>
-          <xs:element ref="pc:EntityInstanceReference" minOccurs="0"/>
-          <xs:element ref="pc:EntityId1" minOccurs="0"/>
-          <xs:element ref="pc:EntityId2" minOccurs="0"/>
-          <xs:element ref="pc:EntityId3" minOccurs="0"/>
-          <xs:element ref="pc:EntityId4" minOccurs="0"/>
-          <xs:element ref="pc:EntityId5" minOccurs="0"/>
-        </xs:sequence>
-      </xs:complexType>
-    </xs:element>
-    <xs:element name="EntityDisplayName" type="xs:string"/>
-    <xs:element name="EntityInstanceReference" type="xs:string"/>
-    <xs:element name="EntityId1" type="xs:string"/>
-    <xs:element name="EntityId2" type="xs:string"/>
-    <xs:element name="EntityId3" type="xs:string"/>
-    <xs:element name="EntityId4" type="xs:string"/>
-    <xs:element name="EntityId5" type="xs:string"/>
-    <xs:element name="Terms">
-      <xs:complexType>
-        <xs:sequence>
-          <xs:element ref="pc:TermInfo" minOccurs="0" maxOccurs="unbounded"/>
-        </xs:sequence>
-      </xs:complexType>
-    </xs:element>
-    <xs:element name="TermInfo">
-      <xs:complexType>
-        <xs:sequence>
-          <xs:element ref="pc:TermName" minOccurs="0"/>
-          <xs:element ref="pc:TermId" minOccurs="0"/>
-        </xs:sequence>
-      </xs:complexType>
-    </xs:element>
-    <xs:element name="TermName" type="xs:string"/>
-    <xs:element name="TermId" type="xs:string"/>
-  </xs:schema>
-</ct:contentTypeSchema>
-</file>
-
-<file path=customXml/itemProps1.xml><?xml version="1.0" encoding="utf-8"?>
+<file path=customXml/itemProps2.xml><?xml version="1.0" encoding="utf-8"?>
 <ds:datastoreItem xmlns:ds="http://schemas.openxmlformats.org/officeDocument/2006/customXml" ds:itemID="{11111111-1234-1234-1234-123412341234}">
   <ds:schemaRefs>
     <ds:schemaRef ds:uri="http://customooxmlschemas.google.com/"/>
@@ -22224,32 +22357,7 @@
 </ds:datastoreItem>
 </file>
 
-<file path=customXml/itemProps2.xml><?xml version="1.0" encoding="utf-8"?>
-<ds:datastoreItem xmlns:ds="http://schemas.openxmlformats.org/officeDocument/2006/customXml" ds:itemID="{038ECA9E-3AC2-4841-9944-C2555DB6A71C}">
-  <ds:schemaRefs>
-    <ds:schemaRef ds:uri="http://schemas.microsoft.com/sharepoint/v3/contenttype/forms"/>
-  </ds:schemaRefs>
-</ds:datastoreItem>
-</file>
-
 <file path=customXml/itemProps3.xml><?xml version="1.0" encoding="utf-8"?>
-<ds:datastoreItem xmlns:ds="http://schemas.openxmlformats.org/officeDocument/2006/customXml" ds:itemID="{CDBA94C9-1F9F-433C-AEE3-C0201E2EB0C2}">
-  <ds:schemaRefs>
-    <ds:schemaRef ds:uri="http://schemas.openxmlformats.org/officeDocument/2006/bibliography"/>
-  </ds:schemaRefs>
-</ds:datastoreItem>
-</file>
-
-<file path=customXml/itemProps4.xml><?xml version="1.0" encoding="utf-8"?>
-<ds:datastoreItem xmlns:ds="http://schemas.openxmlformats.org/officeDocument/2006/customXml" ds:itemID="{0D5BE524-FA35-4F1A-B6C6-29B804411182}">
-  <ds:schemaRefs>
-    <ds:schemaRef ds:uri="http://schemas.microsoft.com/office/2006/metadata/properties"/>
-    <ds:schemaRef ds:uri="http://schemas.microsoft.com/office/infopath/2007/PartnerControls"/>
-  </ds:schemaRefs>
-</ds:datastoreItem>
-</file>
-
-<file path=customXml/itemProps5.xml><?xml version="1.0" encoding="utf-8"?>
 <ds:datastoreItem xmlns:ds="http://schemas.openxmlformats.org/officeDocument/2006/customXml" ds:itemID="{E429DB93-14AE-4639-A78D-C7BE2E7BAD01}">
   <ds:schemaRefs>
     <ds:schemaRef ds:uri="http://schemas.microsoft.com/office/2006/metadata/contentType"/>
@@ -22267,6 +22375,23 @@
 </ds:datastoreItem>
 </file>
 
+<file path=customXml/itemProps4.xml><?xml version="1.0" encoding="utf-8"?>
+<ds:datastoreItem xmlns:ds="http://schemas.openxmlformats.org/officeDocument/2006/customXml" ds:itemID="{0D5BE524-FA35-4F1A-B6C6-29B804411182}">
+  <ds:schemaRefs>
+    <ds:schemaRef ds:uri="http://schemas.microsoft.com/office/2006/metadata/properties"/>
+    <ds:schemaRef ds:uri="http://schemas.microsoft.com/office/infopath/2007/PartnerControls"/>
+  </ds:schemaRefs>
+</ds:datastoreItem>
+</file>
+
+<file path=customXml/itemProps5.xml><?xml version="1.0" encoding="utf-8"?>
+<ds:datastoreItem xmlns:ds="http://schemas.openxmlformats.org/officeDocument/2006/customXml" ds:itemID="{CDBA94C9-1F9F-433C-AEE3-C0201E2EB0C2}">
+  <ds:schemaRefs>
+    <ds:schemaRef ds:uri="http://schemas.openxmlformats.org/officeDocument/2006/bibliography"/>
+  </ds:schemaRefs>
+</ds:datastoreItem>
+</file>
+
 <file path=docMetadata/LabelInfo.xml><?xml version="1.0" encoding="utf-8"?>
 <clbl:labelList xmlns:clbl="http://schemas.microsoft.com/office/2020/mipLabelMetadata">
   <clbl:label id="{cfa792cf-7768-4341-8857-81754c2afa1f}" enabled="0" method="" siteId="{cfa792cf-7768-4341-8857-81754c2afa1f}" removed="1"/>

</xml_diff>